<commit_message>
all vars in models aim 2
</commit_message>
<xml_diff>
--- a/docs/drafts/CH1_QUAIL.docx
+++ b/docs/drafts/CH1_QUAIL.docx
@@ -39,15 +39,7 @@
         <w:spacing w:before="240" w:line="276" w:lineRule="auto"/>
       </w:pPr>
       <w:r>
-        <w:t>Water insecurity as a global and urban problem; Mexico City/</w:t>
-      </w:r>
-      <w:proofErr w:type="spellStart"/>
-      <w:r>
-        <w:t>Iztapalapa</w:t>
-      </w:r>
-      <w:proofErr w:type="spellEnd"/>
-      <w:r>
-        <w:t xml:space="preserve"> context</w:t>
+        <w:t>Water insecurity as a global and urban problem; Mexico City/Iztapalapa context</w:t>
       </w:r>
     </w:p>
     <w:p>
@@ -59,31 +51,7 @@
         <w:spacing w:line="276" w:lineRule="auto"/>
       </w:pPr>
       <w:r>
-        <w:t xml:space="preserve">Definition of household water insecurity? In urban settings: From </w:t>
-      </w:r>
-      <w:proofErr w:type="spellStart"/>
-      <w:r>
-        <w:t>jepson</w:t>
-      </w:r>
-      <w:proofErr w:type="spellEnd"/>
-      <w:r>
-        <w:t xml:space="preserve"> 2021, </w:t>
-      </w:r>
-      <w:proofErr w:type="spellStart"/>
-      <w:r>
-        <w:t>torreon</w:t>
-      </w:r>
-      <w:proofErr w:type="spellEnd"/>
-      <w:r>
-        <w:t xml:space="preserve">, </w:t>
-      </w:r>
-      <w:proofErr w:type="spellStart"/>
-      <w:r>
-        <w:t>mexico</w:t>
-      </w:r>
-      <w:proofErr w:type="spellEnd"/>
-      <w:r>
-        <w:t xml:space="preserve">: Household water insecurity. </w:t>
+        <w:t xml:space="preserve">Definition of household water insecurity? In urban settings: From jepson 2021, torreon, mexico: Household water insecurity. </w:t>
       </w:r>
     </w:p>
     <w:p>
@@ -95,15 +63,7 @@
         <w:spacing w:line="276" w:lineRule="auto"/>
       </w:pPr>
       <w:r>
-        <w:t xml:space="preserve">Cases such as </w:t>
-      </w:r>
-      <w:proofErr w:type="spellStart"/>
-      <w:r>
-        <w:t>mexico</w:t>
-      </w:r>
-      <w:proofErr w:type="spellEnd"/>
-      <w:r>
-        <w:t xml:space="preserve"> city that have infrastructure for water delivery (percentage coverage is about 95%), and yet, an important portion of the population has an intermittent water supply (%). </w:t>
+        <w:t xml:space="preserve">Cases such as mexico city that have infrastructure for water delivery (percentage coverage is about 95%), and yet, an important portion of the population has an intermittent water supply (%). </w:t>
       </w:r>
     </w:p>
     <w:p>
@@ -115,41 +75,7 @@
         <w:spacing w:line="276" w:lineRule="auto"/>
       </w:pPr>
       <w:r>
-        <w:t xml:space="preserve">Importance - local </w:t>
-      </w:r>
-      <w:proofErr w:type="spellStart"/>
-      <w:r>
-        <w:t>biologies</w:t>
-      </w:r>
-      <w:proofErr w:type="spellEnd"/>
-      <w:r>
-        <w:t xml:space="preserve"> (</w:t>
-      </w:r>
-      <w:proofErr w:type="spellStart"/>
-      <w:r>
-        <w:t>wutich</w:t>
-      </w:r>
-      <w:proofErr w:type="spellEnd"/>
-      <w:r>
-        <w:t xml:space="preserve"> 2020), multiplicity of the water insecurity experience. Urban environment comes with a set of specific challenges. </w:t>
-      </w:r>
-      <w:proofErr w:type="gramStart"/>
-      <w:r>
-        <w:t>So</w:t>
-      </w:r>
-      <w:proofErr w:type="gramEnd"/>
-      <w:r>
-        <w:t xml:space="preserve"> measuring it using one universal tool has limitations. Need to study water insecurity in relation to specific health outcomes of interest and the social relationships and expectations in which water management and use is </w:t>
-      </w:r>
-      <w:proofErr w:type="spellStart"/>
-      <w:proofErr w:type="gramStart"/>
-      <w:r>
-        <w:t>inmersed.Reecent</w:t>
-      </w:r>
-      <w:proofErr w:type="spellEnd"/>
-      <w:proofErr w:type="gramEnd"/>
-      <w:r>
-        <w:t xml:space="preserve"> studies have found that gender is an important factor, experience of children, relationship with food insecurity and multiplicative effect of having both (Mexico). </w:t>
+        <w:t xml:space="preserve">Importance - local biologies (wutich 2020), multiplicity of the water insecurity experience. Urban environment comes with a set of specific challenges. So measuring it using one universal tool has limitations. Need to study water insecurity in relation to specific health outcomes of interest and the social relationships and expectations in which water management and use is inmersed.Reecent studies have found that gender is an important factor, experience of children, relationship with food insecurity and multiplicative effect of having both (Mexico). </w:t>
       </w:r>
     </w:p>
     <w:p>
@@ -161,57 +87,7 @@
         <w:spacing w:line="276" w:lineRule="auto"/>
       </w:pPr>
       <w:r>
-        <w:t xml:space="preserve">Many studies in a national or state level in </w:t>
-      </w:r>
-      <w:proofErr w:type="spellStart"/>
-      <w:r>
-        <w:t>mexico</w:t>
-      </w:r>
-      <w:proofErr w:type="spellEnd"/>
-      <w:r>
-        <w:t xml:space="preserve">. Now we know more about how different metrics behave due to the incorporation of </w:t>
-      </w:r>
-      <w:proofErr w:type="spellStart"/>
-      <w:r>
-        <w:t>hwise</w:t>
-      </w:r>
-      <w:proofErr w:type="spellEnd"/>
-      <w:r>
-        <w:t xml:space="preserve"> in </w:t>
-      </w:r>
-      <w:proofErr w:type="spellStart"/>
-      <w:proofErr w:type="gramStart"/>
-      <w:r>
-        <w:t>ensanut.There</w:t>
-      </w:r>
-      <w:proofErr w:type="spellEnd"/>
-      <w:proofErr w:type="gramEnd"/>
-      <w:r>
-        <w:t xml:space="preserve"> is tremendous value in those studies, they are representative at the national level and have revealed important connections to mental health and food insecurity and socioeconomic status. Have traced changes over time, the </w:t>
-      </w:r>
-      <w:proofErr w:type="gramStart"/>
-      <w:r>
-        <w:t>most commonly reported</w:t>
-      </w:r>
-      <w:proofErr w:type="gramEnd"/>
-      <w:r>
-        <w:t xml:space="preserve"> experiences in urban vs rural environments, and the lack of relationship between frequency and intensity of droughts and household water insecurity. </w:t>
-      </w:r>
-      <w:proofErr w:type="gramStart"/>
-      <w:r>
-        <w:t>This studies</w:t>
-      </w:r>
-      <w:proofErr w:type="gramEnd"/>
-      <w:r>
-        <w:t xml:space="preserve"> allow us to have a very extensive understanding of the problematic at the national level. At the same time, the data has only been presented in aggregated forms, do not allow to understand the local experience of places with </w:t>
-      </w:r>
-      <w:proofErr w:type="gramStart"/>
-      <w:r>
-        <w:t>particular infrastructures</w:t>
-      </w:r>
-      <w:proofErr w:type="gramEnd"/>
-      <w:r>
-        <w:t xml:space="preserve"> and histories of the settlement and expectations and reference points. </w:t>
+        <w:t xml:space="preserve">Many studies in a national or state level in mexico. Now we know more about how different metrics behave due to the incorporation of hwise in ensanut.There is tremendous value in those studies, they are representative at the national level and have revealed important connections to mental health and food insecurity and socioeconomic status. Have traced changes over time, the most commonly reported experiences in urban vs rural environments, and the lack of relationship between frequency and intensity of droughts and household water insecurity. This studies allow us to have a very extensive understanding of the problematic at the national level. At the same time, the data has only been presented in aggregated forms, do not allow to understand the local experience of places with particular infrastructures and histories of the settlement and expectations and reference points. </w:t>
       </w:r>
     </w:p>
     <w:p>
@@ -223,47 +99,7 @@
         <w:spacing w:after="240" w:line="276" w:lineRule="auto"/>
       </w:pPr>
       <w:r>
-        <w:t xml:space="preserve">This is the first study of this kind (biocultural, responding to the water insecurity call made by </w:t>
-      </w:r>
-      <w:proofErr w:type="spellStart"/>
-      <w:r>
-        <w:t>wutich</w:t>
-      </w:r>
-      <w:proofErr w:type="spellEnd"/>
-      <w:r>
-        <w:t xml:space="preserve"> 2020) to focus on </w:t>
-      </w:r>
-      <w:proofErr w:type="spellStart"/>
-      <w:r>
-        <w:t>iztapalapa</w:t>
-      </w:r>
-      <w:proofErr w:type="spellEnd"/>
-      <w:r>
-        <w:t xml:space="preserve">. </w:t>
-      </w:r>
-      <w:proofErr w:type="spellStart"/>
-      <w:r>
-        <w:t>Iztapalapa</w:t>
-      </w:r>
-      <w:proofErr w:type="spellEnd"/>
-      <w:r>
-        <w:t xml:space="preserve"> ranks last among Mexico City's 16 </w:t>
-      </w:r>
-      <w:proofErr w:type="spellStart"/>
-      <w:r>
-        <w:t>alcaldías</w:t>
-      </w:r>
-      <w:proofErr w:type="spellEnd"/>
-      <w:r>
-        <w:t xml:space="preserve"> in perceived water quality (González-Villarreal). This evaluation assessed three dimensions: perceived water quality, whether the supply is sufficient to meet household needs, and perceived scarcity. Scores increase when residents perceive their water positively, consider it adequate for all their needs, and do not experience scarcity. By these criteria, approximately 70% of </w:t>
-      </w:r>
-      <w:proofErr w:type="spellStart"/>
-      <w:r>
-        <w:t>Iztapalapa's</w:t>
-      </w:r>
-      <w:proofErr w:type="spellEnd"/>
-      <w:r>
-        <w:t xml:space="preserve"> population rates their water as poor or very poor.</w:t>
+        <w:t>This is the first study of this kind (biocultural, responding to the water insecurity call made by wutich 2020) to focus on iztapalapa. Iztapalapa ranks last among Mexico City's 16 alcaldías in perceived water quality (González-Villarreal). This evaluation assessed three dimensions: perceived water quality, whether the supply is sufficient to meet household needs, and perceived scarcity. Scores increase when residents perceive their water positively, consider it adequate for all their needs, and do not experience scarcity. By these criteria, approximately 70% of Iztapalapa's population rates their water as poor or very poor.</w:t>
       </w:r>
     </w:p>
     <w:p>
@@ -285,25 +121,7 @@
           <w:b/>
           <w:bCs/>
         </w:rPr>
-        <w:t xml:space="preserve">(a) Identify if objective water insecurity is associated with perceived stress among women in </w:t>
-      </w:r>
-      <w:proofErr w:type="spellStart"/>
-      <w:r>
-        <w:rPr>
-          <w:rFonts w:ascii="Times" w:eastAsia="Times" w:hAnsi="Times" w:cs="Times"/>
-          <w:b/>
-          <w:bCs/>
-        </w:rPr>
-        <w:t>Iztapalapa</w:t>
-      </w:r>
-      <w:proofErr w:type="spellEnd"/>
-      <w:r>
-        <w:rPr>
-          <w:rFonts w:ascii="Times" w:eastAsia="Times" w:hAnsi="Times" w:cs="Times"/>
-          <w:b/>
-          <w:bCs/>
-        </w:rPr>
-        <w:t xml:space="preserve"> (b) identify the components of water insecurity that may be a source of distress for these women. </w:t>
+        <w:t xml:space="preserve">(a) Identify if objective water insecurity is associated with perceived stress among women in Iztapalapa (b) identify the components of water insecurity that may be a source of distress for these women. </w:t>
       </w:r>
     </w:p>
     <w:p>
@@ -355,31 +173,7 @@
         <w:spacing w:after="240" w:line="276" w:lineRule="auto"/>
       </w:pPr>
       <w:r>
-        <w:t xml:space="preserve">Study </w:t>
-      </w:r>
-      <w:proofErr w:type="gramStart"/>
-      <w:r>
-        <w:t>aims:</w:t>
-      </w:r>
-      <w:proofErr w:type="gramEnd"/>
-      <w:r>
-        <w:t xml:space="preserve"> examine links between water insecurity and psychological </w:t>
-      </w:r>
-      <w:proofErr w:type="gramStart"/>
-      <w:r>
-        <w:t>stress, and</w:t>
-      </w:r>
-      <w:proofErr w:type="gramEnd"/>
-      <w:r>
-        <w:t xml:space="preserve"> identify the main components of water insecurity driving perceived stress in </w:t>
-      </w:r>
-      <w:proofErr w:type="spellStart"/>
-      <w:r>
-        <w:t>Iztapalapa</w:t>
-      </w:r>
-      <w:proofErr w:type="spellEnd"/>
-      <w:r>
-        <w:t>.</w:t>
+        <w:t>Study aims: examine links between water insecurity and psychological stress, and identify the main components of water insecurity driving perceived stress in Iztapalapa.</w:t>
       </w:r>
     </w:p>
     <w:p/>
@@ -449,15 +243,7 @@
         <w:spacing w:line="276" w:lineRule="auto"/>
       </w:pPr>
       <w:r>
-        <w:t xml:space="preserve">Water </w:t>
-      </w:r>
-      <w:proofErr w:type="gramStart"/>
-      <w:r>
-        <w:t>worry</w:t>
-      </w:r>
-      <w:proofErr w:type="gramEnd"/>
-      <w:r>
-        <w:t xml:space="preserve"> as distinct from objective water access (Jepson et al. 2021)</w:t>
+        <w:t>Water worry as distinct from objective water access (Jepson et al. 2021)</w:t>
       </w:r>
     </w:p>
     <w:p>
@@ -481,15 +267,7 @@
         <w:spacing w:after="240" w:line="276" w:lineRule="auto"/>
       </w:pPr>
       <w:r>
-        <w:t xml:space="preserve">Water infrastructure in </w:t>
-      </w:r>
-      <w:proofErr w:type="spellStart"/>
-      <w:r>
-        <w:t>Iztapalapa</w:t>
-      </w:r>
-      <w:proofErr w:type="spellEnd"/>
-      <w:r>
-        <w:t>: intermittency, storage dependence, hours of supply</w:t>
+        <w:t>Water infrastructure in Iztapalapa: intermittency, storage dependence, hours of supply</w:t>
       </w:r>
     </w:p>
     <w:p>
@@ -518,15 +296,7 @@
         <w:spacing w:line="276" w:lineRule="auto"/>
       </w:pPr>
       <w:r>
-        <w:t>Water worry and water affect literature (</w:t>
-      </w:r>
-      <w:proofErr w:type="spellStart"/>
-      <w:r>
-        <w:t>Wutich</w:t>
-      </w:r>
-      <w:proofErr w:type="spellEnd"/>
-      <w:r>
-        <w:t>, Jepson et al.)</w:t>
+        <w:t>Water worry and water affect literature (Wutich, Jepson et al.)</w:t>
       </w:r>
     </w:p>
     <w:p>
@@ -580,21 +350,12 @@
       <w:pPr>
         <w:spacing w:before="240" w:after="240"/>
       </w:pPr>
-      <w:proofErr w:type="spellStart"/>
       <w:r>
         <w:rPr>
           <w:b/>
           <w:bCs/>
         </w:rPr>
-        <w:t>Migeot</w:t>
-      </w:r>
-      <w:proofErr w:type="spellEnd"/>
-      <w:r>
-        <w:rPr>
-          <w:b/>
-          <w:bCs/>
-        </w:rPr>
-        <w:t xml:space="preserve"> et al. (2024)</w:t>
+        <w:t>Migeot et al. (2024)</w:t>
       </w:r>
       <w:r>
         <w:t xml:space="preserve"> — "Allostasis, health, and development in Latin America," </w:t>
@@ -607,30 +368,14 @@
         <w:t>Neuroscience &amp; Biobehavioral Reviews</w:t>
       </w:r>
       <w:r>
-        <w:t>. It's recent, Latin America–</w:t>
-      </w:r>
-      <w:proofErr w:type="gramStart"/>
-      <w:r>
-        <w:t>specific, and</w:t>
-      </w:r>
-      <w:proofErr w:type="gramEnd"/>
-      <w:r>
-        <w:t xml:space="preserve"> explicitly frames chronic psychosocial stressors (including resource insecurity) as accumulating into allostatic load in this region. The focus is </w:t>
-      </w:r>
-      <w:proofErr w:type="gramStart"/>
-      <w:r>
-        <w:t>developmental</w:t>
-      </w:r>
-      <w:proofErr w:type="gramEnd"/>
-      <w:r>
-        <w:t xml:space="preserve"> but the theoretical framework applies to your adult sample.</w:t>
+        <w:t>. It's recent, Latin America–specific, and explicitly frames chronic psychosocial stressors (including resource insecurity) as accumulating into allostatic load in this region. The focus is developmental but the theoretical framework applies to your adult sample.</w:t>
       </w:r>
     </w:p>
     <w:p>
       <w:pPr>
         <w:spacing w:before="240" w:after="240"/>
         <w:sectPr>
-          <w:footerReference w:type="default" r:id="rId5"/>
+          <w:footerReference w:type="default" r:id="rId7"/>
           <w:pgSz w:w="12240" w:h="15840"/>
           <w:pgMar w:top="1440" w:right="1440" w:bottom="1440" w:left="1440" w:header="720" w:footer="720" w:gutter="0"/>
           <w:pgNumType w:start="1"/>
@@ -662,21 +407,7 @@
         <w:rPr>
           <w:rFonts w:ascii="Arial Unicode MS" w:eastAsia="Arial Unicode MS" w:hAnsi="Arial Unicode MS" w:cs="Arial Unicode MS"/>
         </w:rPr>
-        <w:t xml:space="preserve"> — is your strongest option. It's recent, Latin American, biocultural, and directly links water insecurity to chronic stress embodiment (using hair cortisol). It also uses the exact conceptual move you're </w:t>
-      </w:r>
-      <w:proofErr w:type="gramStart"/>
-      <w:r>
-        <w:rPr>
-          <w:rFonts w:ascii="Arial Unicode MS" w:eastAsia="Arial Unicode MS" w:hAnsi="Arial Unicode MS" w:cs="Arial Unicode MS"/>
-        </w:rPr>
-        <w:t>making:</w:t>
-      </w:r>
-      <w:proofErr w:type="gramEnd"/>
-      <w:r>
-        <w:rPr>
-          <w:rFonts w:ascii="Arial Unicode MS" w:eastAsia="Arial Unicode MS" w:hAnsi="Arial Unicode MS" w:cs="Arial Unicode MS"/>
-        </w:rPr>
-        <w:t xml:space="preserve"> water insecurity → repeated bodily/functional consequences → chronic stress. Rural Bolivia ≠ urban Mexico City, but the mechanism is the same and it's the closest available.</w:t>
+        <w:t xml:space="preserve"> — is your strongest option. It's recent, Latin American, biocultural, and directly links water insecurity to chronic stress embodiment (using hair cortisol). It also uses the exact conceptual move you're making: water insecurity → repeated bodily/functional consequences → chronic stress. Rural Bolivia ≠ urban Mexico City, but the mechanism is the same and it's the closest available.</w:t>
       </w:r>
     </w:p>
     <w:p>
@@ -699,31 +430,7 @@
         <w:spacing w:before="80" w:after="80" w:line="276" w:lineRule="auto"/>
       </w:pPr>
       <w:r>
-        <w:t xml:space="preserve">Household water insecurity is a pervasive stressor in low- and middle-income urban settings, yet its psychological consequences and the role of seasonal water availability in shaping those consequences remain poorly understood. This study examines the associations between household water insecurity and two psychosocial outcomes (perceived stress and water-related emotional appraisal) in an urban Mexican </w:t>
-      </w:r>
-      <w:proofErr w:type="gramStart"/>
-      <w:r>
-        <w:t>population, and</w:t>
-      </w:r>
-      <w:proofErr w:type="gramEnd"/>
-      <w:r>
-        <w:t xml:space="preserve"> characterizes the experience of water insecurity within the household. Cross-sectional data (n=399) were collected in two stages (rainy and dry season) from residents of </w:t>
-      </w:r>
-      <w:proofErr w:type="spellStart"/>
-      <w:r>
-        <w:t>Iztapalapa</w:t>
-      </w:r>
-      <w:proofErr w:type="spellEnd"/>
-      <w:r>
-        <w:t xml:space="preserve">, in Mexico City (mean age 32.3 ± 7.4 years). Perceived stress was assessed with the PSS-14 (range 0–56) and water-related emotions were coded as a binary outcome (negative vs. positive). Ordinary least squares and binary logistic regression models were fit with progressive inclusion of water related variables. General characterization of water insecurity experiences across multiple dimensions was obtained using the 12-item Household Water </w:t>
-      </w:r>
-      <w:proofErr w:type="spellStart"/>
-      <w:r>
-        <w:t>InSecurity</w:t>
-      </w:r>
-      <w:proofErr w:type="spellEnd"/>
-      <w:r>
-        <w:t xml:space="preserve"> Experiences (HWISE) scale.</w:t>
+        <w:t>Household water insecurity is a pervasive stressor in low- and middle-income urban settings, yet its psychological consequences and the role of seasonal water availability in shaping those consequences remain poorly understood. This study examines the associations between household water insecurity and two psychosocial outcomes (perceived stress and water-related emotional appraisal) in an urban Mexican population, and characterizes the experience of water insecurity within the household. Cross-sectional data (n=399) were collected in two stages (rainy and dry season) from residents of Iztapalapa, in Mexico City (mean age 32.3 ± 7.4 years). Perceived stress was assessed with the PSS-14 (range 0–56) and water-related emotions were coded as a binary outcome (negative vs. positive). Ordinary least squares and binary logistic regression models were fit with progressive inclusion of water related variables. General characterization of water insecurity experiences across multiple dimensions was obtained using the 12-item Household Water InSecurity Experiences (HWISE) scale.</w:t>
       </w:r>
     </w:p>
     <w:p>
@@ -828,15 +535,7 @@
         <w:spacing w:before="80" w:after="80" w:line="276" w:lineRule="auto"/>
       </w:pPr>
       <w:r>
-        <w:t xml:space="preserve">Comparison to </w:t>
-      </w:r>
-      <w:proofErr w:type="spellStart"/>
-      <w:r>
-        <w:t>Wutich’s</w:t>
-      </w:r>
-      <w:proofErr w:type="spellEnd"/>
-      <w:r>
-        <w:t xml:space="preserve"> Bolivia work and Jepson et al. Mexico findings</w:t>
+        <w:t>Comparison to Wutich’s Bolivia work and Jepson et al. Mexico findings</w:t>
       </w:r>
     </w:p>
     <w:p>
@@ -921,15 +620,7 @@
         <w:spacing w:before="80" w:after="80" w:line="276" w:lineRule="auto"/>
       </w:pPr>
       <w:r>
-        <w:t>Future directions (</w:t>
-      </w:r>
-      <w:proofErr w:type="spellStart"/>
-      <w:r>
-        <w:t>DNAm</w:t>
-      </w:r>
-      <w:proofErr w:type="spellEnd"/>
-      <w:r>
-        <w:t xml:space="preserve"> paper, longitudinal work)</w:t>
+        <w:t>Future directions (DNAm paper, longitudinal work)</w:t>
       </w:r>
     </w:p>
     <w:p>
@@ -961,15 +652,7 @@
         <w:spacing w:before="80" w:after="80" w:line="276" w:lineRule="auto"/>
       </w:pPr>
       <w:r>
-        <w:t xml:space="preserve">Classification errors if different cutoffs proposed by the HWISE. 5-item subset of the HWISE may exhibit a more reliable and cost-effective behavior than 12 HWISE. Much better to use clothes, plans, food, hands, body and a cutoff of 3, than worry, plans, hands and drink as suggested by HWISE. Worry/drink </w:t>
-      </w:r>
-      <w:proofErr w:type="gramStart"/>
-      <w:r>
-        <w:t>in particular have</w:t>
-      </w:r>
-      <w:proofErr w:type="gramEnd"/>
-      <w:r>
-        <w:t xml:space="preserve"> very low discrimination value, and ‘no water’ is criticized because it is not understood (cite Shamah-Levy 2022).</w:t>
+        <w:t>Classification errors if different cutoffs proposed by the HWISE. 5-item subset of the HWISE may exhibit a more reliable and cost-effective behavior than 12 HWISE. Much better to use clothes, plans, food, hands, body and a cutoff of 3, than worry, plans, hands and drink as suggested by HWISE. Worry/drink in particular have very low discrimination value, and ‘no water’ is criticized because it is not understood (cite Shamah-Levy 2022).</w:t>
       </w:r>
     </w:p>
     <w:p>
@@ -1058,15 +741,7 @@
         <w:spacing w:before="80" w:after="80" w:line="276" w:lineRule="auto"/>
       </w:pPr>
       <w:r>
-        <w:t xml:space="preserve">Torreón, Coahuila: HWISE-12 mean 7.6 ±7.9; water worry </w:t>
-      </w:r>
-      <w:proofErr w:type="spellStart"/>
-      <w:r>
-        <w:t>subscore</w:t>
-      </w:r>
-      <w:proofErr w:type="spellEnd"/>
-      <w:r>
-        <w:t xml:space="preserve"> 2.45 ±2.44; high water insecurity (&gt;11) 27.1%; PSS 19.72 ± 8.98; n=500.</w:t>
+        <w:t>Torreón, Coahuila: HWISE-12 mean 7.6 ±7.9; water worry subscore 2.45 ±2.44; high water insecurity (&gt;11) 27.1%; PSS 19.72 ± 8.98; n=500.</w:t>
       </w:r>
     </w:p>
     <w:p>
@@ -1098,15 +773,7 @@
         <w:spacing w:before="80" w:after="80" w:line="276" w:lineRule="auto"/>
       </w:pPr>
       <w:r>
-        <w:t xml:space="preserve">The prevalence of water insecurity using the HWISE 12-points cut-off is 28%, much higher than the average reported for the country using ENSANUT 2021-2024 (39,599 households). This study also reports a prevalence of 16.2% in urban areas across the country. The proportion is more </w:t>
-      </w:r>
-      <w:proofErr w:type="gramStart"/>
-      <w:r>
-        <w:t>similar to</w:t>
-      </w:r>
-      <w:proofErr w:type="gramEnd"/>
-      <w:r>
-        <w:t xml:space="preserve"> the states with higher water insecurity in the country (Guerrero, 30.6%; Baja California Sur, 29%) and more than twice that of Ciudad de Mexico (13.6%).</w:t>
+        <w:t>The prevalence of water insecurity using the HWISE 12-points cut-off is 28%, much higher than the average reported for the country using ENSANUT 2021-2024 (39,599 households). This study also reports a prevalence of 16.2% in urban areas across the country. The proportion is more similar to the states with higher water insecurity in the country (Guerrero, 30.6%; Baja California Sur, 29%) and more than twice that of Ciudad de Mexico (13.6%).</w:t>
       </w:r>
     </w:p>
     <w:p>
@@ -1145,57 +812,13 @@
         </w:rPr>
       </w:pPr>
       <w:r>
-        <w:t xml:space="preserve">Study will be complemented with information on water quality-item not included in HWISE scale. No information about intra-household water insecurity. Different water insecurity measures may be associated with the same health outcomes, but certain dimensions of water </w:t>
-      </w:r>
-      <w:proofErr w:type="spellStart"/>
-      <w:r>
-        <w:t>insec</w:t>
-      </w:r>
-      <w:proofErr w:type="spellEnd"/>
-      <w:r>
-        <w:t xml:space="preserve"> may have stronger relationships with a given health outcome. </w:t>
-      </w:r>
-      <w:proofErr w:type="spellStart"/>
+        <w:t xml:space="preserve">Study will be complemented with information on water quality-item not included in HWISE scale. No information about intra-household water insecurity. Different water insecurity measures may be associated with the same health outcomes, but certain dimensions of water insec may have stronger relationships with a given health outcome. </w:t>
+      </w:r>
       <w:r>
         <w:rPr>
           <w:lang w:val="es-ES"/>
         </w:rPr>
-        <w:t>Worry</w:t>
-      </w:r>
-      <w:proofErr w:type="spellEnd"/>
-      <w:r>
-        <w:rPr>
-          <w:lang w:val="es-ES"/>
-        </w:rPr>
-        <w:t xml:space="preserve"> → PSS, </w:t>
-      </w:r>
-      <w:proofErr w:type="spellStart"/>
-      <w:r>
-        <w:rPr>
-          <w:lang w:val="es-ES"/>
-        </w:rPr>
-        <w:t>hygiene</w:t>
-      </w:r>
-      <w:proofErr w:type="spellEnd"/>
-      <w:r>
-        <w:rPr>
-          <w:lang w:val="es-ES"/>
-        </w:rPr>
-        <w:t xml:space="preserve"> → </w:t>
-      </w:r>
-      <w:proofErr w:type="spellStart"/>
-      <w:r>
-        <w:rPr>
-          <w:lang w:val="es-ES"/>
-        </w:rPr>
-        <w:t>diarrhoea</w:t>
-      </w:r>
-      <w:proofErr w:type="spellEnd"/>
-      <w:r>
-        <w:rPr>
-          <w:lang w:val="es-ES"/>
-        </w:rPr>
-        <w:t>.</w:t>
+        <w:t>Worry → PSS, hygiene → diarrhoea.</w:t>
       </w:r>
     </w:p>
     <w:p>
@@ -1220,21 +843,21 @@
         <w:rPr>
           <w:lang w:val="es-ES"/>
         </w:rPr>
-        <w:t xml:space="preserve">5. Notas en </w:t>
-      </w:r>
-      <w:proofErr w:type="gramStart"/>
-      <w:r>
+        <w:t>5. Notas en Español (ENSANUT / HWISE)</w:t>
+      </w:r>
+    </w:p>
+    <w:p>
+      <w:pPr>
+        <w:spacing w:before="80" w:after="80" w:line="276" w:lineRule="auto"/>
         <w:rPr>
           <w:lang w:val="es-ES"/>
         </w:rPr>
-        <w:t>Español</w:t>
-      </w:r>
-      <w:proofErr w:type="gramEnd"/>
+      </w:pPr>
       <w:r>
         <w:rPr>
           <w:lang w:val="es-ES"/>
         </w:rPr>
-        <w:t xml:space="preserve"> (ENSANUT / HWISE)</w:t>
+        <w:t>Consistencia interna de 0.928 (alpha de Cronbach).</w:t>
       </w:r>
     </w:p>
     <w:p>
@@ -1248,21 +871,21 @@
         <w:rPr>
           <w:lang w:val="es-ES"/>
         </w:rPr>
-        <w:t>Consistencia interna de 0.928 (</w:t>
-      </w:r>
-      <w:proofErr w:type="spellStart"/>
-      <w:r>
+        <w:t>Comportamiento equivalente de los items en contextos urbanos y rurales y por terciles de condiciones de bienestar.</w:t>
+      </w:r>
+    </w:p>
+    <w:p>
+      <w:pPr>
+        <w:spacing w:before="80" w:after="80" w:line="276" w:lineRule="auto"/>
         <w:rPr>
           <w:lang w:val="es-ES"/>
         </w:rPr>
-        <w:t>alpha</w:t>
-      </w:r>
-      <w:proofErr w:type="spellEnd"/>
+      </w:pPr>
       <w:r>
         <w:rPr>
           <w:lang w:val="es-ES"/>
         </w:rPr>
-        <w:t xml:space="preserve"> de Cronbach).</w:t>
+        <w:t>Asociacion significativa con variables predictoras de inseguridad del agua.</w:t>
       </w:r>
     </w:p>
     <w:p>
@@ -1276,35 +899,35 @@
         <w:rPr>
           <w:lang w:val="es-ES"/>
         </w:rPr>
-        <w:t xml:space="preserve">Comportamiento equivalente de los </w:t>
-      </w:r>
-      <w:proofErr w:type="spellStart"/>
-      <w:r>
+        <w:t>Validacion del HWISE en Mexico se hizo en 499 hogares localizados en las ciudad de Torreon, Coahuila, y Merida, Yucatan (refs 14 y 17) mas rato citan 10 y 12 como aplicacion en lenguaje local como parte de un estudio multicentrico.</w:t>
+      </w:r>
+    </w:p>
+    <w:p>
+      <w:pPr>
+        <w:spacing w:before="80" w:after="80" w:line="276" w:lineRule="auto"/>
         <w:rPr>
           <w:lang w:val="es-ES"/>
         </w:rPr>
-        <w:t>items</w:t>
-      </w:r>
-      <w:proofErr w:type="spellEnd"/>
+      </w:pPr>
       <w:r>
         <w:rPr>
           <w:lang w:val="es-ES"/>
         </w:rPr>
-        <w:t xml:space="preserve"> en contextos urbanos y rurales y por </w:t>
-      </w:r>
-      <w:proofErr w:type="spellStart"/>
-      <w:r>
+        <w:t>2021 se incorporo a la encuesta nacional de salud y nutricion (ENSANUT continua 2021). Encuesta probabilistica y representativa a nivel pais, regiones y areas urbanas y rurales.</w:t>
+      </w:r>
+    </w:p>
+    <w:p>
+      <w:pPr>
+        <w:spacing w:before="80" w:after="80" w:line="276" w:lineRule="auto"/>
         <w:rPr>
           <w:lang w:val="es-ES"/>
         </w:rPr>
-        <w:t>terciles</w:t>
-      </w:r>
-      <w:proofErr w:type="spellEnd"/>
+      </w:pPr>
       <w:r>
         <w:rPr>
           <w:lang w:val="es-ES"/>
         </w:rPr>
-        <w:t xml:space="preserve"> de condiciones de bienestar.</w:t>
+        <w:t>Se aplico en 12463 hogares en 31 estados del pais y CDMX.</w:t>
       </w:r>
     </w:p>
     <w:p>
@@ -1314,820 +937,180 @@
           <w:lang w:val="es-ES"/>
         </w:rPr>
       </w:pPr>
-      <w:proofErr w:type="spellStart"/>
       <w:r>
         <w:rPr>
           <w:lang w:val="es-ES"/>
         </w:rPr>
-        <w:t>Asociacion</w:t>
-      </w:r>
-      <w:proofErr w:type="spellEnd"/>
-      <w:r>
+        <w:t>Revisaron y adaptaron las frases contenidas en cada pregunta. Se aplico a 20 personas, luego 200 hogares. Con esto se mejoro la redaccion de los items 4, 9 y 12.</w:t>
+      </w:r>
+    </w:p>
+    <w:p>
+      <w:pPr>
+        <w:spacing w:before="80" w:after="80" w:line="276" w:lineRule="auto"/>
         <w:rPr>
           <w:lang w:val="es-ES"/>
         </w:rPr>
-        <w:t xml:space="preserve"> significativa con variables predictoras de inseguridad del agua.</w:t>
-      </w:r>
-    </w:p>
-    <w:p>
-      <w:pPr>
-        <w:spacing w:before="80" w:after="80" w:line="276" w:lineRule="auto"/>
+      </w:pPr>
+      <w:r>
         <w:rPr>
           <w:lang w:val="es-ES"/>
         </w:rPr>
-      </w:pPr>
-      <w:proofErr w:type="spellStart"/>
-      <w:r>
+        <w:t>Apuntan a referencia 23 para decir que el ideal es Cronbach alpha mayor a 0.8.</w:t>
+      </w:r>
+    </w:p>
+    <w:p>
+      <w:pPr>
+        <w:spacing w:before="80" w:after="80" w:line="276" w:lineRule="auto"/>
         <w:rPr>
           <w:lang w:val="es-ES"/>
         </w:rPr>
-        <w:t>Validacion</w:t>
-      </w:r>
-      <w:proofErr w:type="spellEnd"/>
+      </w:pPr>
       <w:r>
         <w:rPr>
           <w:lang w:val="es-ES"/>
         </w:rPr>
-        <w:t xml:space="preserve"> del HWISE en </w:t>
-      </w:r>
-      <w:proofErr w:type="spellStart"/>
-      <w:r>
+        <w:t>Mas del 60% reporta no haber experimentado ninguna de las experiencias medidas. Los items mas reportados con 1 a 3 fueron: 2. Se interrumpio o disminuyo el suministro de agua en el hogar (35.8%), 1. Se preocupo por no tener suficiente agua (31.6%), 3. No pudo lavar ropa por falta de agua (30.8%).</w:t>
+      </w:r>
+    </w:p>
+    <w:p>
+      <w:pPr>
+        <w:spacing w:before="80" w:after="80" w:line="276" w:lineRule="auto"/>
         <w:rPr>
           <w:lang w:val="es-ES"/>
         </w:rPr>
-        <w:t>Mexico</w:t>
-      </w:r>
-      <w:proofErr w:type="spellEnd"/>
+      </w:pPr>
       <w:r>
         <w:rPr>
           <w:lang w:val="es-ES"/>
         </w:rPr>
-        <w:t xml:space="preserve"> se hizo en 499 hogares localizados en </w:t>
-      </w:r>
-      <w:proofErr w:type="gramStart"/>
-      <w:r>
+        <w:t>Mencionan que la pregunta de “agua no apta para beber” presento una correlacion muy baja. Correlacion es 0.495 vs. overall 0.928.</w:t>
+      </w:r>
+    </w:p>
+    <w:p>
+      <w:pPr>
+        <w:pStyle w:val="Heading3"/>
         <w:rPr>
           <w:lang w:val="es-ES"/>
         </w:rPr>
-        <w:t>las ciudad</w:t>
-      </w:r>
-      <w:proofErr w:type="gramEnd"/>
+      </w:pPr>
       <w:r>
         <w:rPr>
           <w:lang w:val="es-ES"/>
         </w:rPr>
-        <w:t xml:space="preserve"> de </w:t>
-      </w:r>
-      <w:proofErr w:type="spellStart"/>
-      <w:r>
+        <w:t>Diferencias con ENSANUT items</w:t>
+      </w:r>
+    </w:p>
+    <w:p>
+      <w:pPr>
+        <w:spacing w:before="80" w:after="80" w:line="276" w:lineRule="auto"/>
         <w:rPr>
           <w:lang w:val="es-ES"/>
         </w:rPr>
-        <w:t>Torreon</w:t>
-      </w:r>
-      <w:proofErr w:type="spellEnd"/>
+      </w:pPr>
       <w:r>
         <w:rPr>
           <w:lang w:val="es-ES"/>
         </w:rPr>
-        <w:t xml:space="preserve">, Coahuila, y </w:t>
-      </w:r>
-      <w:proofErr w:type="spellStart"/>
-      <w:r>
+        <w:t>Diferencia con ENSANUT continua 2021 → pregunta 2 yo tuve ejemplos (por ejemplo, menor presion o interrupcion del agua entubada, menos agua de la esperada, menos lluvia, menor caudal en rio, etc.)</w:t>
+      </w:r>
+    </w:p>
+    <w:p>
+      <w:pPr>
+        <w:spacing w:before="80" w:after="80" w:line="276" w:lineRule="auto"/>
         <w:rPr>
           <w:lang w:val="es-ES"/>
         </w:rPr>
-        <w:t>Merida</w:t>
-      </w:r>
-      <w:proofErr w:type="spellEnd"/>
+      </w:pPr>
       <w:r>
         <w:rPr>
           <w:lang w:val="es-ES"/>
         </w:rPr>
-        <w:t xml:space="preserve">, </w:t>
-      </w:r>
-      <w:proofErr w:type="spellStart"/>
-      <w:r>
+        <w:t>48% de la ENSANUT 2021 reporto “nunca” para los 12 items.</w:t>
+      </w:r>
+    </w:p>
+    <w:p>
+      <w:pPr>
+        <w:spacing w:before="80" w:after="80" w:line="276" w:lineRule="auto"/>
         <w:rPr>
           <w:lang w:val="es-ES"/>
         </w:rPr>
-        <w:t>Yucatan</w:t>
-      </w:r>
-      <w:proofErr w:type="spellEnd"/>
+      </w:pPr>
       <w:r>
         <w:rPr>
           <w:lang w:val="es-ES"/>
         </w:rPr>
-        <w:t xml:space="preserve"> (</w:t>
-      </w:r>
-      <w:proofErr w:type="spellStart"/>
-      <w:r>
+        <w:t>Item 4 (ENSANUT): tales como problemas para obtener o distribuir agua dentro del hogar...</w:t>
+      </w:r>
+    </w:p>
+    <w:p>
+      <w:pPr>
+        <w:spacing w:before="80" w:after="80" w:line="276" w:lineRule="auto"/>
         <w:rPr>
           <w:lang w:val="es-ES"/>
         </w:rPr>
-        <w:t>refs</w:t>
-      </w:r>
-      <w:proofErr w:type="spellEnd"/>
+      </w:pPr>
       <w:r>
         <w:rPr>
           <w:lang w:val="es-ES"/>
         </w:rPr>
-        <w:t xml:space="preserve"> 14 y 17) </w:t>
-      </w:r>
-      <w:proofErr w:type="spellStart"/>
-      <w:r>
+        <w:lastRenderedPageBreak/>
+        <w:t>Item 7 (ENSANUT) pregunta si no habia suficiente agua; yo hablo de problemas con el agua.</w:t>
+      </w:r>
+    </w:p>
+    <w:p>
+      <w:pPr>
+        <w:spacing w:before="80" w:after="80" w:line="276" w:lineRule="auto"/>
         <w:rPr>
           <w:lang w:val="es-ES"/>
         </w:rPr>
-        <w:t>mas</w:t>
-      </w:r>
-      <w:proofErr w:type="spellEnd"/>
+      </w:pPr>
       <w:r>
         <w:rPr>
           <w:lang w:val="es-ES"/>
         </w:rPr>
-        <w:t xml:space="preserve"> rato citan 10 y 12 como </w:t>
-      </w:r>
-      <w:proofErr w:type="spellStart"/>
-      <w:r>
+        <w:t>Item 11 mia: En las ultimas 4 semanas, ¿con que frecuencia no hubo en su hogar agua apta o recomendable para uso en el hogar o para consumo humano?</w:t>
+      </w:r>
+    </w:p>
+    <w:p>
+      <w:pPr>
+        <w:spacing w:before="80" w:after="80" w:line="276" w:lineRule="auto"/>
         <w:rPr>
           <w:lang w:val="es-ES"/>
         </w:rPr>
-        <w:t>aplicacion</w:t>
-      </w:r>
-      <w:proofErr w:type="spellEnd"/>
+      </w:pPr>
       <w:r>
         <w:rPr>
           <w:lang w:val="es-ES"/>
         </w:rPr>
-        <w:t xml:space="preserve"> en lenguaje local como parte de un estudio </w:t>
-      </w:r>
-      <w:proofErr w:type="spellStart"/>
-      <w:r>
+        <w:t>Item 11 ENSANUT: En las ultimas 4 semanas, ¿con que frecuencia hubo en su hogar agua que no se puede tomar?</w:t>
+      </w:r>
+    </w:p>
+    <w:p>
+      <w:pPr>
+        <w:pStyle w:val="Heading3"/>
         <w:rPr>
           <w:lang w:val="es-ES"/>
         </w:rPr>
-        <w:t>multicentrico</w:t>
-      </w:r>
-      <w:proofErr w:type="spellEnd"/>
+      </w:pPr>
       <w:r>
         <w:rPr>
           <w:lang w:val="es-ES"/>
         </w:rPr>
-        <w:t>.</w:t>
-      </w:r>
-    </w:p>
-    <w:p>
-      <w:pPr>
-        <w:spacing w:before="80" w:after="80" w:line="276" w:lineRule="auto"/>
+        <w:t>Citation for ENSANUT HWISE items</w:t>
+      </w:r>
+    </w:p>
+    <w:p>
+      <w:pPr>
+        <w:spacing w:before="80" w:after="80" w:line="276" w:lineRule="auto"/>
+      </w:pPr>
+      <w:r>
         <w:rPr>
           <w:lang w:val="es-ES"/>
         </w:rPr>
-      </w:pPr>
-      <w:r>
-        <w:rPr>
-          <w:lang w:val="es-ES"/>
-        </w:rPr>
-        <w:t xml:space="preserve">2021 se </w:t>
-      </w:r>
-      <w:proofErr w:type="spellStart"/>
-      <w:r>
-        <w:rPr>
-          <w:lang w:val="es-ES"/>
-        </w:rPr>
-        <w:t>incorporo</w:t>
-      </w:r>
-      <w:proofErr w:type="spellEnd"/>
-      <w:r>
-        <w:rPr>
-          <w:lang w:val="es-ES"/>
-        </w:rPr>
-        <w:t xml:space="preserve"> a la encuesta nacional de salud y </w:t>
-      </w:r>
-      <w:proofErr w:type="spellStart"/>
-      <w:r>
-        <w:rPr>
-          <w:lang w:val="es-ES"/>
-        </w:rPr>
-        <w:t>nutricion</w:t>
-      </w:r>
-      <w:proofErr w:type="spellEnd"/>
-      <w:r>
-        <w:rPr>
-          <w:lang w:val="es-ES"/>
-        </w:rPr>
-        <w:t xml:space="preserve"> (ENSANUT continua 2021). Encuesta </w:t>
-      </w:r>
-      <w:proofErr w:type="spellStart"/>
-      <w:r>
-        <w:rPr>
-          <w:lang w:val="es-ES"/>
-        </w:rPr>
-        <w:t>probabilistica</w:t>
-      </w:r>
-      <w:proofErr w:type="spellEnd"/>
-      <w:r>
-        <w:rPr>
-          <w:lang w:val="es-ES"/>
-        </w:rPr>
-        <w:t xml:space="preserve"> y representativa a nivel </w:t>
-      </w:r>
-      <w:proofErr w:type="spellStart"/>
-      <w:r>
-        <w:rPr>
-          <w:lang w:val="es-ES"/>
-        </w:rPr>
-        <w:t>pais</w:t>
-      </w:r>
-      <w:proofErr w:type="spellEnd"/>
-      <w:r>
-        <w:rPr>
-          <w:lang w:val="es-ES"/>
-        </w:rPr>
-        <w:t xml:space="preserve">, regiones y </w:t>
-      </w:r>
-      <w:proofErr w:type="spellStart"/>
-      <w:r>
-        <w:rPr>
-          <w:lang w:val="es-ES"/>
-        </w:rPr>
-        <w:t>areas</w:t>
-      </w:r>
-      <w:proofErr w:type="spellEnd"/>
-      <w:r>
-        <w:rPr>
-          <w:lang w:val="es-ES"/>
-        </w:rPr>
-        <w:t xml:space="preserve"> urbanas y rurales.</w:t>
-      </w:r>
-    </w:p>
-    <w:p>
-      <w:pPr>
-        <w:spacing w:before="80" w:after="80" w:line="276" w:lineRule="auto"/>
-        <w:rPr>
-          <w:lang w:val="es-ES"/>
-        </w:rPr>
-      </w:pPr>
-      <w:r>
-        <w:rPr>
-          <w:lang w:val="es-ES"/>
-        </w:rPr>
-        <w:t xml:space="preserve">Se aplico en 12463 hogares en 31 estados del </w:t>
-      </w:r>
-      <w:proofErr w:type="spellStart"/>
-      <w:r>
-        <w:rPr>
-          <w:lang w:val="es-ES"/>
-        </w:rPr>
-        <w:t>pais</w:t>
-      </w:r>
-      <w:proofErr w:type="spellEnd"/>
-      <w:r>
-        <w:rPr>
-          <w:lang w:val="es-ES"/>
-        </w:rPr>
-        <w:t xml:space="preserve"> y CDMX.</w:t>
-      </w:r>
-    </w:p>
-    <w:p>
-      <w:pPr>
-        <w:spacing w:before="80" w:after="80" w:line="276" w:lineRule="auto"/>
-        <w:rPr>
-          <w:lang w:val="es-ES"/>
-        </w:rPr>
-      </w:pPr>
-      <w:r>
-        <w:rPr>
-          <w:lang w:val="es-ES"/>
-        </w:rPr>
-        <w:t xml:space="preserve">Revisaron y adaptaron las frases contenidas en cada pregunta. Se aplico a 20 personas, luego 200 hogares. Con esto se </w:t>
-      </w:r>
-      <w:proofErr w:type="spellStart"/>
-      <w:r>
-        <w:rPr>
-          <w:lang w:val="es-ES"/>
-        </w:rPr>
-        <w:t>mejoro</w:t>
-      </w:r>
-      <w:proofErr w:type="spellEnd"/>
-      <w:r>
-        <w:rPr>
-          <w:lang w:val="es-ES"/>
-        </w:rPr>
-        <w:t xml:space="preserve"> la </w:t>
-      </w:r>
-      <w:proofErr w:type="spellStart"/>
-      <w:r>
-        <w:rPr>
-          <w:lang w:val="es-ES"/>
-        </w:rPr>
-        <w:t>redaccion</w:t>
-      </w:r>
-      <w:proofErr w:type="spellEnd"/>
-      <w:r>
-        <w:rPr>
-          <w:lang w:val="es-ES"/>
-        </w:rPr>
-        <w:t xml:space="preserve"> de los </w:t>
-      </w:r>
-      <w:proofErr w:type="spellStart"/>
-      <w:r>
-        <w:rPr>
-          <w:lang w:val="es-ES"/>
-        </w:rPr>
-        <w:t>items</w:t>
-      </w:r>
-      <w:proofErr w:type="spellEnd"/>
-      <w:r>
-        <w:rPr>
-          <w:lang w:val="es-ES"/>
-        </w:rPr>
-        <w:t xml:space="preserve"> 4, 9 y 12.</w:t>
-      </w:r>
-    </w:p>
-    <w:p>
-      <w:pPr>
-        <w:spacing w:before="80" w:after="80" w:line="276" w:lineRule="auto"/>
-        <w:rPr>
-          <w:lang w:val="es-ES"/>
-        </w:rPr>
-      </w:pPr>
-      <w:r>
-        <w:rPr>
-          <w:lang w:val="es-ES"/>
-        </w:rPr>
-        <w:t xml:space="preserve">Apuntan a referencia 23 para decir que el ideal es Cronbach </w:t>
-      </w:r>
-      <w:proofErr w:type="spellStart"/>
-      <w:r>
-        <w:rPr>
-          <w:lang w:val="es-ES"/>
-        </w:rPr>
-        <w:t>alpha</w:t>
-      </w:r>
-      <w:proofErr w:type="spellEnd"/>
-      <w:r>
-        <w:rPr>
-          <w:lang w:val="es-ES"/>
-        </w:rPr>
-        <w:t xml:space="preserve"> mayor a 0.8.</w:t>
-      </w:r>
-    </w:p>
-    <w:p>
-      <w:pPr>
-        <w:spacing w:before="80" w:after="80" w:line="276" w:lineRule="auto"/>
-        <w:rPr>
-          <w:lang w:val="es-ES"/>
-        </w:rPr>
-      </w:pPr>
-      <w:r>
-        <w:rPr>
-          <w:lang w:val="es-ES"/>
-        </w:rPr>
-        <w:t xml:space="preserve">Mas del 60% reporta no haber experimentado ninguna de las experiencias medidas. Los </w:t>
-      </w:r>
-      <w:proofErr w:type="spellStart"/>
-      <w:r>
-        <w:rPr>
-          <w:lang w:val="es-ES"/>
-        </w:rPr>
-        <w:t>items</w:t>
-      </w:r>
-      <w:proofErr w:type="spellEnd"/>
-      <w:r>
-        <w:rPr>
-          <w:lang w:val="es-ES"/>
-        </w:rPr>
-        <w:t xml:space="preserve"> </w:t>
-      </w:r>
-      <w:proofErr w:type="spellStart"/>
-      <w:r>
-        <w:rPr>
-          <w:lang w:val="es-ES"/>
-        </w:rPr>
-        <w:t>mas</w:t>
-      </w:r>
-      <w:proofErr w:type="spellEnd"/>
-      <w:r>
-        <w:rPr>
-          <w:lang w:val="es-ES"/>
-        </w:rPr>
-        <w:t xml:space="preserve"> reportados con 1 a 3 fueron: 2. Se </w:t>
-      </w:r>
-      <w:proofErr w:type="spellStart"/>
-      <w:r>
-        <w:rPr>
-          <w:lang w:val="es-ES"/>
-        </w:rPr>
-        <w:t>interrumpio</w:t>
-      </w:r>
-      <w:proofErr w:type="spellEnd"/>
-      <w:r>
-        <w:rPr>
-          <w:lang w:val="es-ES"/>
-        </w:rPr>
-        <w:t xml:space="preserve"> o disminuyo el suministro de agua en el hogar (35.8%), 1. Se preocupo por no tener suficiente agua (31.6%), 3. No pudo lavar ropa por falta de agua (30.8%).</w:t>
-      </w:r>
-    </w:p>
-    <w:p>
-      <w:pPr>
-        <w:spacing w:before="80" w:after="80" w:line="276" w:lineRule="auto"/>
-        <w:rPr>
-          <w:lang w:val="es-ES"/>
-        </w:rPr>
-      </w:pPr>
-      <w:r>
-        <w:rPr>
-          <w:lang w:val="es-ES"/>
-        </w:rPr>
-        <w:t xml:space="preserve">Mencionan que la pregunta de “agua no apta para beber” presento una </w:t>
-      </w:r>
-      <w:proofErr w:type="spellStart"/>
-      <w:r>
-        <w:rPr>
-          <w:lang w:val="es-ES"/>
-        </w:rPr>
-        <w:t>correlacion</w:t>
-      </w:r>
-      <w:proofErr w:type="spellEnd"/>
-      <w:r>
-        <w:rPr>
-          <w:lang w:val="es-ES"/>
-        </w:rPr>
-        <w:t xml:space="preserve"> muy baja. </w:t>
-      </w:r>
-      <w:proofErr w:type="spellStart"/>
-      <w:r>
-        <w:rPr>
-          <w:lang w:val="es-ES"/>
-        </w:rPr>
-        <w:t>Correlacion</w:t>
-      </w:r>
-      <w:proofErr w:type="spellEnd"/>
-      <w:r>
-        <w:rPr>
-          <w:lang w:val="es-ES"/>
-        </w:rPr>
-        <w:t xml:space="preserve"> es 0.495 vs. </w:t>
-      </w:r>
-      <w:proofErr w:type="spellStart"/>
-      <w:r>
-        <w:rPr>
-          <w:lang w:val="es-ES"/>
-        </w:rPr>
-        <w:t>overall</w:t>
-      </w:r>
-      <w:proofErr w:type="spellEnd"/>
-      <w:r>
-        <w:rPr>
-          <w:lang w:val="es-ES"/>
-        </w:rPr>
-        <w:t xml:space="preserve"> 0.928.</w:t>
-      </w:r>
-    </w:p>
-    <w:p>
-      <w:pPr>
-        <w:pStyle w:val="Heading3"/>
-        <w:rPr>
-          <w:lang w:val="es-ES"/>
-        </w:rPr>
-      </w:pPr>
-      <w:r>
-        <w:rPr>
-          <w:lang w:val="es-ES"/>
-        </w:rPr>
-        <w:t xml:space="preserve">Diferencias con ENSANUT </w:t>
-      </w:r>
-      <w:proofErr w:type="spellStart"/>
-      <w:r>
-        <w:rPr>
-          <w:lang w:val="es-ES"/>
-        </w:rPr>
-        <w:t>items</w:t>
-      </w:r>
-      <w:proofErr w:type="spellEnd"/>
-    </w:p>
-    <w:p>
-      <w:pPr>
-        <w:spacing w:before="80" w:after="80" w:line="276" w:lineRule="auto"/>
-        <w:rPr>
-          <w:lang w:val="es-ES"/>
-        </w:rPr>
-      </w:pPr>
-      <w:r>
-        <w:rPr>
-          <w:lang w:val="es-ES"/>
-        </w:rPr>
-        <w:t xml:space="preserve">Diferencia con ENSANUT continua 2021 → pregunta 2 yo tuve ejemplos (por ejemplo, menor </w:t>
-      </w:r>
-      <w:proofErr w:type="spellStart"/>
-      <w:r>
-        <w:rPr>
-          <w:lang w:val="es-ES"/>
-        </w:rPr>
-        <w:t>presion</w:t>
-      </w:r>
-      <w:proofErr w:type="spellEnd"/>
-      <w:r>
-        <w:rPr>
-          <w:lang w:val="es-ES"/>
-        </w:rPr>
-        <w:t xml:space="preserve"> o </w:t>
-      </w:r>
-      <w:proofErr w:type="spellStart"/>
-      <w:r>
-        <w:rPr>
-          <w:lang w:val="es-ES"/>
-        </w:rPr>
-        <w:t>interrupcion</w:t>
-      </w:r>
-      <w:proofErr w:type="spellEnd"/>
-      <w:r>
-        <w:rPr>
-          <w:lang w:val="es-ES"/>
-        </w:rPr>
-        <w:t xml:space="preserve"> del agua entubada, menos agua de la esperada, menos lluvia, menor caudal en rio, etc.)</w:t>
-      </w:r>
-    </w:p>
-    <w:p>
-      <w:pPr>
-        <w:spacing w:before="80" w:after="80" w:line="276" w:lineRule="auto"/>
-        <w:rPr>
-          <w:lang w:val="es-ES"/>
-        </w:rPr>
-      </w:pPr>
-      <w:r>
-        <w:rPr>
-          <w:lang w:val="es-ES"/>
-        </w:rPr>
-        <w:t xml:space="preserve">48% de la ENSANUT 2021 reporto “nunca” para los 12 </w:t>
-      </w:r>
-      <w:proofErr w:type="spellStart"/>
-      <w:r>
-        <w:rPr>
-          <w:lang w:val="es-ES"/>
-        </w:rPr>
-        <w:t>items</w:t>
-      </w:r>
-      <w:proofErr w:type="spellEnd"/>
-      <w:r>
-        <w:rPr>
-          <w:lang w:val="es-ES"/>
-        </w:rPr>
-        <w:t>.</w:t>
-      </w:r>
-    </w:p>
-    <w:p>
-      <w:pPr>
-        <w:spacing w:before="80" w:after="80" w:line="276" w:lineRule="auto"/>
-        <w:rPr>
-          <w:lang w:val="es-ES"/>
-        </w:rPr>
-      </w:pPr>
-      <w:proofErr w:type="spellStart"/>
-      <w:r>
-        <w:rPr>
-          <w:lang w:val="es-ES"/>
-        </w:rPr>
-        <w:t>Item</w:t>
-      </w:r>
-      <w:proofErr w:type="spellEnd"/>
-      <w:r>
-        <w:rPr>
-          <w:lang w:val="es-ES"/>
-        </w:rPr>
-        <w:t xml:space="preserve"> 4 (ENSANUT): tales como problemas para obtener o distribuir agua dentro del hogar...</w:t>
-      </w:r>
-    </w:p>
-    <w:p>
-      <w:pPr>
-        <w:spacing w:before="80" w:after="80" w:line="276" w:lineRule="auto"/>
-        <w:rPr>
-          <w:lang w:val="es-ES"/>
-        </w:rPr>
-      </w:pPr>
-      <w:proofErr w:type="spellStart"/>
-      <w:r>
-        <w:rPr>
-          <w:lang w:val="es-ES"/>
-        </w:rPr>
-        <w:lastRenderedPageBreak/>
-        <w:t>Item</w:t>
-      </w:r>
-      <w:proofErr w:type="spellEnd"/>
-      <w:r>
-        <w:rPr>
-          <w:lang w:val="es-ES"/>
-        </w:rPr>
-        <w:t xml:space="preserve"> 7 (ENSANUT) pregunta si no </w:t>
-      </w:r>
-      <w:proofErr w:type="spellStart"/>
-      <w:r>
-        <w:rPr>
-          <w:lang w:val="es-ES"/>
-        </w:rPr>
-        <w:t>habia</w:t>
-      </w:r>
-      <w:proofErr w:type="spellEnd"/>
-      <w:r>
-        <w:rPr>
-          <w:lang w:val="es-ES"/>
-        </w:rPr>
-        <w:t xml:space="preserve"> suficiente agua; yo hablo de problemas con el agua.</w:t>
-      </w:r>
-    </w:p>
-    <w:p>
-      <w:pPr>
-        <w:spacing w:before="80" w:after="80" w:line="276" w:lineRule="auto"/>
-        <w:rPr>
-          <w:lang w:val="es-ES"/>
-        </w:rPr>
-      </w:pPr>
-      <w:proofErr w:type="spellStart"/>
-      <w:r>
-        <w:rPr>
-          <w:lang w:val="es-ES"/>
-        </w:rPr>
-        <w:t>Item</w:t>
-      </w:r>
-      <w:proofErr w:type="spellEnd"/>
-      <w:r>
-        <w:rPr>
-          <w:lang w:val="es-ES"/>
-        </w:rPr>
-        <w:t xml:space="preserve"> 11 </w:t>
-      </w:r>
-      <w:proofErr w:type="spellStart"/>
-      <w:r>
-        <w:rPr>
-          <w:lang w:val="es-ES"/>
-        </w:rPr>
-        <w:t>mia</w:t>
-      </w:r>
-      <w:proofErr w:type="spellEnd"/>
-      <w:r>
-        <w:rPr>
-          <w:lang w:val="es-ES"/>
-        </w:rPr>
-        <w:t xml:space="preserve">: En las </w:t>
-      </w:r>
-      <w:proofErr w:type="spellStart"/>
-      <w:r>
-        <w:rPr>
-          <w:lang w:val="es-ES"/>
-        </w:rPr>
-        <w:t>ultimas</w:t>
-      </w:r>
-      <w:proofErr w:type="spellEnd"/>
-      <w:r>
-        <w:rPr>
-          <w:lang w:val="es-ES"/>
-        </w:rPr>
-        <w:t xml:space="preserve"> 4 semanas, ¿con que frecuencia no hubo en su hogar agua apta o recomendable para uso en el hogar o para consumo humano?</w:t>
-      </w:r>
-    </w:p>
-    <w:p>
-      <w:pPr>
-        <w:spacing w:before="80" w:after="80" w:line="276" w:lineRule="auto"/>
-        <w:rPr>
-          <w:lang w:val="es-ES"/>
-        </w:rPr>
-      </w:pPr>
-      <w:proofErr w:type="spellStart"/>
-      <w:r>
-        <w:rPr>
-          <w:lang w:val="es-ES"/>
-        </w:rPr>
-        <w:t>Item</w:t>
-      </w:r>
-      <w:proofErr w:type="spellEnd"/>
-      <w:r>
-        <w:rPr>
-          <w:lang w:val="es-ES"/>
-        </w:rPr>
-        <w:t xml:space="preserve"> 11 ENSANUT: En las </w:t>
-      </w:r>
-      <w:proofErr w:type="spellStart"/>
-      <w:r>
-        <w:rPr>
-          <w:lang w:val="es-ES"/>
-        </w:rPr>
-        <w:t>ultimas</w:t>
-      </w:r>
-      <w:proofErr w:type="spellEnd"/>
-      <w:r>
-        <w:rPr>
-          <w:lang w:val="es-ES"/>
-        </w:rPr>
-        <w:t xml:space="preserve"> 4 semanas, ¿con que frecuencia hubo en su hogar agua que no se puede tomar?</w:t>
-      </w:r>
-    </w:p>
-    <w:p>
-      <w:pPr>
-        <w:pStyle w:val="Heading3"/>
-        <w:rPr>
-          <w:lang w:val="es-ES"/>
-        </w:rPr>
-      </w:pPr>
-      <w:proofErr w:type="spellStart"/>
-      <w:r>
-        <w:rPr>
-          <w:lang w:val="es-ES"/>
-        </w:rPr>
-        <w:t>Citation</w:t>
-      </w:r>
-      <w:proofErr w:type="spellEnd"/>
-      <w:r>
-        <w:rPr>
-          <w:lang w:val="es-ES"/>
-        </w:rPr>
-        <w:t xml:space="preserve"> </w:t>
-      </w:r>
-      <w:proofErr w:type="spellStart"/>
-      <w:r>
-        <w:rPr>
-          <w:lang w:val="es-ES"/>
-        </w:rPr>
-        <w:t>for</w:t>
-      </w:r>
-      <w:proofErr w:type="spellEnd"/>
-      <w:r>
-        <w:rPr>
-          <w:lang w:val="es-ES"/>
-        </w:rPr>
-        <w:t xml:space="preserve"> ENSANUT HWISE </w:t>
-      </w:r>
-      <w:proofErr w:type="spellStart"/>
-      <w:r>
-        <w:rPr>
-          <w:lang w:val="es-ES"/>
-        </w:rPr>
-        <w:t>items</w:t>
-      </w:r>
-      <w:proofErr w:type="spellEnd"/>
-    </w:p>
-    <w:p>
-      <w:pPr>
-        <w:spacing w:before="80" w:after="80" w:line="276" w:lineRule="auto"/>
-      </w:pPr>
-      <w:r>
-        <w:rPr>
-          <w:lang w:val="es-ES"/>
-        </w:rPr>
-        <w:t xml:space="preserve">Centro de </w:t>
-      </w:r>
-      <w:proofErr w:type="spellStart"/>
-      <w:r>
-        <w:rPr>
-          <w:lang w:val="es-ES"/>
-        </w:rPr>
-        <w:t>Investigacion</w:t>
-      </w:r>
-      <w:proofErr w:type="spellEnd"/>
-      <w:r>
-        <w:rPr>
-          <w:lang w:val="es-ES"/>
-        </w:rPr>
-        <w:t xml:space="preserve"> en </w:t>
-      </w:r>
-      <w:proofErr w:type="spellStart"/>
-      <w:r>
-        <w:rPr>
-          <w:lang w:val="es-ES"/>
-        </w:rPr>
-        <w:t>Evaluacion</w:t>
-      </w:r>
-      <w:proofErr w:type="spellEnd"/>
-      <w:r>
-        <w:rPr>
-          <w:lang w:val="es-ES"/>
-        </w:rPr>
-        <w:t xml:space="preserve"> y Encuestas (CIEE). </w:t>
-      </w:r>
-      <w:proofErr w:type="spellStart"/>
-      <w:r>
-        <w:rPr>
-          <w:lang w:val="es-ES"/>
-        </w:rPr>
-        <w:t>Items</w:t>
-      </w:r>
-      <w:proofErr w:type="spellEnd"/>
-      <w:r>
-        <w:rPr>
-          <w:lang w:val="es-ES"/>
-        </w:rPr>
-        <w:t xml:space="preserve"> de la escala de experiencias de inseguridad del agua (HWISE) usados en la ENSANUT Continua 2021. </w:t>
-      </w:r>
-      <w:r>
-        <w:t xml:space="preserve">Harvard Dataverse. </w:t>
-      </w:r>
-      <w:proofErr w:type="spellStart"/>
-      <w:r>
-        <w:t>doi</w:t>
-      </w:r>
-      <w:proofErr w:type="spellEnd"/>
-      <w:r>
-        <w:t>: 10.7910/DVN/ZSIFBK</w:t>
+        <w:t xml:space="preserve">Centro de Investigacion en Evaluacion y Encuestas (CIEE). Items de la escala de experiencias de inseguridad del agua (HWISE) usados en la ENSANUT Continua 2021. </w:t>
+      </w:r>
+      <w:r>
+        <w:t>Harvard Dataverse. doi: 10.7910/DVN/ZSIFBK</w:t>
       </w:r>
     </w:p>
     <w:p>
@@ -2159,15 +1142,7 @@
         <w:spacing w:before="80" w:after="80" w:line="276" w:lineRule="auto"/>
       </w:pPr>
       <w:r>
-        <w:t>This is your headline finding. Neighborhood classification (objective WI) never predicts PSS in adjusted models. But HWISE does — every single time you add it. This directly answers your overarching question and has strong theoretical payoff: it’s not where you live that stresses you out, it’s how you experience and perceive your water situation. This validates the water affect framework (</w:t>
-      </w:r>
-      <w:proofErr w:type="spellStart"/>
-      <w:r>
-        <w:t>Wutich</w:t>
-      </w:r>
-      <w:proofErr w:type="spellEnd"/>
-      <w:r>
-        <w:t>) and the biocultural emphasis on subjective experience. Lead with this everywhere.</w:t>
+        <w:t>This is your headline finding. Neighborhood classification (objective WI) never predicts PSS in adjusted models. But HWISE does — every single time you add it. This directly answers your overarching question and has strong theoretical payoff: it’s not where you live that stresses you out, it’s how you experience and perceive your water situation. This validates the water affect framework (Wutich) and the biocultural emphasis on subjective experience. Lead with this everywhere.</w:t>
       </w:r>
     </w:p>
     <w:p>
@@ -2251,15 +1226,7 @@
         <w:spacing w:before="80" w:after="80" w:line="276" w:lineRule="auto"/>
       </w:pPr>
       <w:r>
-        <w:t xml:space="preserve">Someone with a </w:t>
-      </w:r>
-      <w:proofErr w:type="spellStart"/>
-      <w:r>
-        <w:t>tinaco</w:t>
-      </w:r>
-      <w:proofErr w:type="spellEnd"/>
-      <w:r>
-        <w:t xml:space="preserve"> who never experiences interruption in their tap access might report “continuous” supply even if their neighborhood technically receives water intermittently. The only genuinely external/structural variable is the neighborhood classification, which comes from the government resolution.</w:t>
+        <w:t>Someone with a tinaco who never experiences interruption in their tap access might report “continuous” supply even if their neighborhood technically receives water intermittently. The only genuinely external/structural variable is the neighborhood classification, which comes from the government resolution.</w:t>
       </w:r>
     </w:p>
     <w:p>
@@ -2372,15 +1339,7 @@
         <w:spacing w:before="80" w:after="80" w:line="276" w:lineRule="auto"/>
       </w:pPr>
       <w:r>
-        <w:t xml:space="preserve">Even though almost </w:t>
-      </w:r>
-      <w:proofErr w:type="gramStart"/>
-      <w:r>
-        <w:t>all of</w:t>
-      </w:r>
-      <w:proofErr w:type="gramEnd"/>
-      <w:r>
-        <w:t xml:space="preserve"> the water security metrics present a significant increase in frequency in the dry season, we found that including seasonality as a covariate did not increase explanatory power for neither outcome. This may mean that seasonality has an important effect on water insecurity, but not on the effects of water insecurity. Interestingly, when the interaction between season and HWISE is included as predictor of PSS, HWISE loses significance, the interaction does not reach significance, but season shows a large and significant negative effect (B=-2.69, CI 5.34, 0.05, p = 0.046).</w:t>
+        <w:t>Even though almost all of the water security metrics present a significant increase in frequency in the dry season, we found that including seasonality as a covariate did not increase explanatory power for neither outcome. This may mean that seasonality has an important effect on water insecurity, but not on the effects of water insecurity. Interestingly, when the interaction between season and HWISE is included as predictor of PSS, HWISE loses significance, the interaction does not reach significance, but season shows a large and significant negative effect (B=-2.69, CI 5.34, 0.05, p = 0.046).</w:t>
       </w:r>
     </w:p>
     <w:p>
@@ -2521,15 +1480,7 @@
       </w:r>
       <w:r>
         <w:lastRenderedPageBreak/>
-        <w:t xml:space="preserve">pressure adequacy. When </w:t>
-      </w:r>
-      <w:proofErr w:type="spellStart"/>
-      <w:r>
-        <w:t>emo_type</w:t>
-      </w:r>
-      <w:proofErr w:type="spellEnd"/>
-      <w:r>
-        <w:t xml:space="preserve"> was the outcome, HW_ANGRY or HW_SHAME were not estimated.</w:t>
+        <w:t>pressure adequacy. When emo_type was the outcome, HW_ANGRY or HW_SHAME were not estimated.</w:t>
       </w:r>
     </w:p>
     <w:p>
@@ -2545,23 +1496,7 @@
         <w:spacing w:before="80" w:after="80" w:line="276" w:lineRule="auto"/>
       </w:pPr>
       <w:r>
-        <w:t xml:space="preserve">To examine whether water-related emotional response represents a pathway through which water insecurity affects general perceived stress, a causal mediation analysis was conducted using the mediation package in R, following the potential outcomes framework. The modified HWISE total score served as the exposure, </w:t>
-      </w:r>
-      <w:proofErr w:type="spellStart"/>
-      <w:r>
-        <w:t>emo_type</w:t>
-      </w:r>
-      <w:proofErr w:type="spellEnd"/>
-      <w:r>
-        <w:t xml:space="preserve"> as the mediator, and PSS_TOTAL as the outcome, with core covariates in both models. ACME, ADE, total effect, and proportion mediated were estimated using 1,000 bootstrap iterations. Sensitivity analyses assessed robustness to violations of the sequential </w:t>
-      </w:r>
-      <w:proofErr w:type="spellStart"/>
-      <w:r>
-        <w:t>ignorability</w:t>
-      </w:r>
-      <w:proofErr w:type="spellEnd"/>
-      <w:r>
-        <w:t xml:space="preserve"> assumption using the sensitivity parameter ρ.</w:t>
+        <w:t>To examine whether water-related emotional response represents a pathway through which water insecurity affects general perceived stress, a causal mediation analysis was conducted using the mediation package in R, following the potential outcomes framework. The modified HWISE total score served as the exposure, emo_type as the mediator, and PSS_TOTAL as the outcome, with core covariates in both models. ACME, ADE, total effect, and proportion mediated were estimated using 1,000 bootstrap iterations. Sensitivity analyses assessed robustness to violations of the sequential ignorability assumption using the sensitivity parameter ρ.</w:t>
       </w:r>
     </w:p>
     <w:p>
@@ -2593,23 +1528,7 @@
         <w:spacing w:before="80" w:after="80" w:line="276" w:lineRule="auto"/>
       </w:pPr>
       <w:r>
-        <w:t>The achieved sample of N=399 provides adequate power for primary regression analyses. For linear regression (PSS_TOTAL), N=399 can detect minimum f²≈0.02 (small effect). For logistic regression (</w:t>
-      </w:r>
-      <w:proofErr w:type="spellStart"/>
-      <w:r>
-        <w:t>emo_type</w:t>
-      </w:r>
-      <w:proofErr w:type="spellEnd"/>
-      <w:r>
-        <w:t xml:space="preserve">), given 66% negative emotion prevalence, N=399 provides 80% power to detect OR≈1.5 for continuous predictors and OR≈2.0 for binary predictors. Computed using </w:t>
-      </w:r>
-      <w:proofErr w:type="spellStart"/>
-      <w:r>
-        <w:t>pwr</w:t>
-      </w:r>
-      <w:proofErr w:type="spellEnd"/>
-      <w:r>
-        <w:t xml:space="preserve"> package in R.</w:t>
+        <w:t>The achieved sample of N=399 provides adequate power for primary regression analyses. For linear regression (PSS_TOTAL), N=399 can detect minimum f²≈0.02 (small effect). For logistic regression (emo_type), given 66% negative emotion prevalence, N=399 provides 80% power to detect OR≈1.5 for continuous predictors and OR≈2.0 for binary predictors. Computed using pwr package in R.</w:t>
       </w:r>
     </w:p>
     <w:p>
@@ -2666,39 +1585,15 @@
       </w:pPr>
       <w:r>
         <w:lastRenderedPageBreak/>
-        <w:t>Primary association (Core2): HWISE total was positively associated with PSS (</w:t>
-      </w:r>
-      <w:proofErr w:type="gramStart"/>
-      <w:r>
-        <w:t>F(</w:t>
-      </w:r>
-      <w:proofErr w:type="gramEnd"/>
-      <w:r>
-        <w:t>2, 333) = 7.28, p &lt; 0.001; ΔAdj.R² = 0.036). Season alone did not predict PSS (</w:t>
-      </w:r>
-      <w:proofErr w:type="gramStart"/>
-      <w:r>
-        <w:t>F(</w:t>
-      </w:r>
-      <w:proofErr w:type="gramEnd"/>
-      <w:r>
-        <w:t>1, 340) = 0.07, p = 0.80).</w:t>
-      </w:r>
-    </w:p>
-    <w:p>
-      <w:pPr>
-        <w:spacing w:before="80" w:after="80" w:line="276" w:lineRule="auto"/>
-      </w:pPr>
-      <w:r>
-        <w:t>Season × HWISE interaction (M1c): best fit among HWISE specifications (</w:t>
-      </w:r>
-      <w:proofErr w:type="gramStart"/>
-      <w:r>
-        <w:t>F(</w:t>
-      </w:r>
-      <w:proofErr w:type="gramEnd"/>
-      <w:r>
-        <w:t>3, 332) = 6.36, p &lt; 0.001; Adj.R² = 0.043). In Season 1, HWISE-PSS association non-significant (β = 0.11, CI: −0.08, 0.30; p = 0.2). In Season 2, slope significantly steeper (interaction β = 0.28, CI: 0.02, 0.53; p = 0.037), yielding Season 2 simple slope of β = 0.39. Season 2 intercept lower (β = −3.2, CI: −5.9, −0.49; p = 0.021).</w:t>
+        <w:t>Primary association (Core2): HWISE total was positively associated with PSS (F(2, 333) = 7.28, p &lt; 0.001; ΔAdj.R² = 0.036). Season alone did not predict PSS (F(1, 340) = 0.07, p = 0.80).</w:t>
+      </w:r>
+    </w:p>
+    <w:p>
+      <w:pPr>
+        <w:spacing w:before="80" w:after="80" w:line="276" w:lineRule="auto"/>
+      </w:pPr>
+      <w:r>
+        <w:t>Season × HWISE interaction (M1c): best fit among HWISE specifications (F(3, 332) = 6.36, p &lt; 0.001; Adj.R² = 0.043). In Season 1, HWISE-PSS association non-significant (β = 0.11, CI: −0.08, 0.30; p = 0.2). In Season 2, slope significantly steeper (interaction β = 0.28, CI: 0.02, 0.53; p = 0.037), yielding Season 2 simple slope of β = 0.39. Season 2 intercept lower (β = −3.2, CI: −5.9, −0.49; p = 0.021).</w:t>
       </w:r>
     </w:p>
     <w:p>
@@ -2714,55 +1609,15 @@
         <w:spacing w:before="80" w:after="80" w:line="276" w:lineRule="auto"/>
       </w:pPr>
       <w:r>
-        <w:t>Primary association (Core2): HWISE strongly associated with negative emotion (LRT χ</w:t>
-      </w:r>
-      <w:proofErr w:type="gramStart"/>
-      <w:r>
-        <w:t>²(</w:t>
-      </w:r>
-      <w:proofErr w:type="gramEnd"/>
-      <w:r>
-        <w:t xml:space="preserve">2) = 65.27, p &lt; 0.001; </w:t>
-      </w:r>
-      <w:proofErr w:type="spellStart"/>
-      <w:r>
-        <w:t>ΔMcFadden</w:t>
-      </w:r>
-      <w:proofErr w:type="spellEnd"/>
-      <w:r>
-        <w:t xml:space="preserve"> R² = 0.163). Season alone was not significant (LRT χ</w:t>
-      </w:r>
-      <w:proofErr w:type="gramStart"/>
-      <w:r>
-        <w:t>²(</w:t>
-      </w:r>
-      <w:proofErr w:type="gramEnd"/>
-      <w:r>
-        <w:t>1) = 1.88, p = 0.17).</w:t>
-      </w:r>
-    </w:p>
-    <w:p>
-      <w:pPr>
-        <w:spacing w:before="80" w:after="80" w:line="276" w:lineRule="auto"/>
-      </w:pPr>
-      <w:r>
-        <w:t>Season × HWISE interaction: marginal but non-significant (Δχ</w:t>
-      </w:r>
-      <w:proofErr w:type="gramStart"/>
-      <w:r>
-        <w:t>²(</w:t>
-      </w:r>
-      <w:proofErr w:type="gramEnd"/>
-      <w:r>
-        <w:t xml:space="preserve">1) = 3.12, p = 0.077; </w:t>
-      </w:r>
-      <w:proofErr w:type="spellStart"/>
-      <w:r>
-        <w:t>ΔMcFadden</w:t>
-      </w:r>
-      <w:proofErr w:type="spellEnd"/>
-      <w:r>
-        <w:t xml:space="preserve"> R² = 0.008). Core2 pooled estimate retained.</w:t>
+        <w:t>Primary association (Core2): HWISE strongly associated with negative emotion (LRT χ²(2) = 65.27, p &lt; 0.001; ΔMcFadden R² = 0.163). Season alone was not significant (LRT χ²(1) = 1.88, p = 0.17).</w:t>
+      </w:r>
+    </w:p>
+    <w:p>
+      <w:pPr>
+        <w:spacing w:before="80" w:after="80" w:line="276" w:lineRule="auto"/>
+      </w:pPr>
+      <w:r>
+        <w:t>Season × HWISE interaction: marginal but non-significant (Δχ²(1) = 3.12, p = 0.077; ΔMcFadden R² = 0.008). Core2 pooled estimate retained.</w:t>
       </w:r>
     </w:p>
     <w:p>
@@ -2850,15 +1705,7 @@
         <w:pStyle w:val="Heading1"/>
       </w:pPr>
       <w:r>
-        <w:t xml:space="preserve">9. Background Fragments (water poverty, </w:t>
-      </w:r>
-      <w:proofErr w:type="spellStart"/>
-      <w:r>
-        <w:t>Iztapalapa</w:t>
-      </w:r>
-      <w:proofErr w:type="spellEnd"/>
-      <w:r>
-        <w:t>)</w:t>
+        <w:t>9. Background Fragments (water poverty, Iztapalapa)</w:t>
       </w:r>
     </w:p>
     <w:p>
@@ -2870,36 +1717,15 @@
       </w:r>
       <w:r>
         <w:lastRenderedPageBreak/>
-        <w:t xml:space="preserve">Lawrence, </w:t>
-      </w:r>
-      <w:proofErr w:type="spellStart"/>
-      <w:r>
-        <w:t>Meigh</w:t>
-      </w:r>
-      <w:proofErr w:type="spellEnd"/>
-      <w:r>
-        <w:t xml:space="preserve"> and Sullivan considers five components: Resource, Access, Capacity (human development index), Use (domestic, industrial, agricultural), and Environment (Land Use Change, Vegetation, Water Quality). López Álvarez emphasizes water as a crucial link between climate system, human society, and the environment. Molle and </w:t>
-      </w:r>
-      <w:proofErr w:type="spellStart"/>
-      <w:r>
-        <w:t>Mollinga</w:t>
-      </w:r>
-      <w:proofErr w:type="spellEnd"/>
-      <w:r>
-        <w:t xml:space="preserve"> classify water use into potable, domestic, production, economic, and environmental needs vs. physical, economic, management, and institutional/political scarcity. (JG Vazquez)</w:t>
-      </w:r>
-    </w:p>
-    <w:p>
-      <w:pPr>
-        <w:spacing w:before="80" w:after="80" w:line="276" w:lineRule="auto"/>
-      </w:pPr>
-      <w:proofErr w:type="spellStart"/>
-      <w:r>
-        <w:t>Iztapalapa</w:t>
-      </w:r>
-      <w:proofErr w:type="spellEnd"/>
-      <w:r>
-        <w:t xml:space="preserve"> covers 7.5% of the surface area of CDMX, elevation 2100m. 184 colonias. Population 1,835,486 (2020, INEGI). Ranks 7th of 16 in crime and insecurity.</w:t>
+        <w:t>Lawrence, Meigh and Sullivan considers five components: Resource, Access, Capacity (human development index), Use (domestic, industrial, agricultural), and Environment (Land Use Change, Vegetation, Water Quality). López Álvarez emphasizes water as a crucial link between climate system, human society, and the environment. Molle and Mollinga classify water use into potable, domestic, production, economic, and environmental needs vs. physical, economic, management, and institutional/political scarcity. (JG Vazquez)</w:t>
+      </w:r>
+    </w:p>
+    <w:p>
+      <w:pPr>
+        <w:spacing w:before="80" w:after="80" w:line="276" w:lineRule="auto"/>
+      </w:pPr>
+      <w:r>
+        <w:t>Iztapalapa covers 7.5% of the surface area of CDMX, elevation 2100m. 184 colonias. Population 1,835,486 (2020, INEGI). Ranks 7th of 16 in crime and insecurity.</w:t>
       </w:r>
     </w:p>
     <w:p>
@@ -2931,23 +1757,7 @@
         <w:spacing w:before="80" w:after="80" w:line="276" w:lineRule="auto"/>
       </w:pPr>
       <w:r>
-        <w:t xml:space="preserve">Compare </w:t>
-      </w:r>
-      <w:proofErr w:type="spellStart"/>
-      <w:r>
-        <w:t>Teotongo</w:t>
-      </w:r>
-      <w:proofErr w:type="spellEnd"/>
-      <w:r>
-        <w:t>/</w:t>
-      </w:r>
-      <w:proofErr w:type="spellStart"/>
-      <w:r>
-        <w:t>Tezonco</w:t>
-      </w:r>
-      <w:proofErr w:type="spellEnd"/>
-      <w:r>
-        <w:t>: stat test to say they are not super different — or maybe obvious from descriptive statistics/table?</w:t>
+        <w:t>Compare Teotongo/Tezonco: stat test to say they are not super different — or maybe obvious from descriptive statistics/table?</w:t>
       </w:r>
     </w:p>
     <w:p>
@@ -3002,68 +1812,16 @@
       <w:pPr>
         <w:spacing w:before="80" w:after="80" w:line="276" w:lineRule="auto"/>
       </w:pPr>
-      <w:proofErr w:type="spellStart"/>
-      <w:r>
-        <w:t>t.</w:t>
-      </w:r>
-      <w:proofErr w:type="gramStart"/>
-      <w:r>
-        <w:t>test</w:t>
-      </w:r>
-      <w:proofErr w:type="spellEnd"/>
-      <w:r>
-        <w:t>(</w:t>
-      </w:r>
-      <w:proofErr w:type="spellStart"/>
-      <w:proofErr w:type="gramEnd"/>
-      <w:r>
-        <w:t>hours_supply</w:t>
-      </w:r>
-      <w:proofErr w:type="spellEnd"/>
-      <w:r>
-        <w:t xml:space="preserve"> ~ area, data = </w:t>
-      </w:r>
-      <w:proofErr w:type="spellStart"/>
-      <w:r>
-        <w:t>df</w:t>
-      </w:r>
-      <w:proofErr w:type="spellEnd"/>
-      <w:r>
-        <w:t>)</w:t>
-      </w:r>
-    </w:p>
-    <w:p>
-      <w:pPr>
-        <w:spacing w:before="80" w:after="80" w:line="276" w:lineRule="auto"/>
-      </w:pPr>
-      <w:proofErr w:type="spellStart"/>
-      <w:r>
-        <w:t>wilcox.</w:t>
-      </w:r>
-      <w:proofErr w:type="gramStart"/>
-      <w:r>
-        <w:t>test</w:t>
-      </w:r>
-      <w:proofErr w:type="spellEnd"/>
-      <w:r>
-        <w:t>(</w:t>
-      </w:r>
-      <w:proofErr w:type="spellStart"/>
-      <w:proofErr w:type="gramEnd"/>
-      <w:r>
-        <w:t>hours_supply</w:t>
-      </w:r>
-      <w:proofErr w:type="spellEnd"/>
-      <w:r>
-        <w:t xml:space="preserve"> ~ area, data = </w:t>
-      </w:r>
-      <w:proofErr w:type="spellStart"/>
-      <w:r>
-        <w:t>df</w:t>
-      </w:r>
-      <w:proofErr w:type="spellEnd"/>
-      <w:r>
-        <w:t>)</w:t>
+      <w:r>
+        <w:t>t.test(hours_supply ~ area, data = df)</w:t>
+      </w:r>
+    </w:p>
+    <w:p>
+      <w:pPr>
+        <w:spacing w:before="80" w:after="80" w:line="276" w:lineRule="auto"/>
+      </w:pPr>
+      <w:r>
+        <w:t>wilcox.test(hours_supply ~ area, data = df)</w:t>
       </w:r>
     </w:p>
     <w:p>
@@ -3088,6 +1846,648 @@
       </w:pPr>
       <w:r>
         <w:t>999=Missing/lost, 555=Other, 444=Ambiguous, 333=Pending</w:t>
+      </w:r>
+    </w:p>
+    <w:p>
+      <w:pPr>
+        <w:spacing w:before="100" w:after="100"/>
+        <w:rPr>
+          <w:rFonts w:eastAsia="Times New Roman"/>
+          <w:color w:val="000000"/>
+        </w:rPr>
+      </w:pPr>
+    </w:p>
+    <w:p>
+      <w:pPr>
+        <w:spacing w:before="100" w:after="100"/>
+        <w:rPr>
+          <w:rFonts w:eastAsia="Times New Roman"/>
+          <w:color w:val="000000"/>
+        </w:rPr>
+      </w:pPr>
+    </w:p>
+    <w:p>
+      <w:pPr>
+        <w:spacing w:before="100" w:after="100"/>
+        <w:rPr>
+          <w:rFonts w:eastAsia="Times New Roman"/>
+          <w:color w:val="000000"/>
+        </w:rPr>
+      </w:pPr>
+    </w:p>
+    <w:p>
+      <w:pPr>
+        <w:spacing w:before="100" w:after="100"/>
+        <w:rPr>
+          <w:rFonts w:ascii="Times New Roman" w:eastAsia="Times New Roman" w:hAnsi="Times New Roman" w:cs="Times New Roman"/>
+          <w:sz w:val="24"/>
+          <w:szCs w:val="24"/>
+        </w:rPr>
+      </w:pPr>
+      <w:r>
+        <w:rPr>
+          <w:rFonts w:eastAsia="Times New Roman"/>
+          <w:color w:val="000000"/>
+        </w:rPr>
+        <w:t xml:space="preserve">Our study adds a new assessment of water-related distress through the classification of how participants feel about their water service (water-related emotions). This item served as a summary of participants’ perception of a complex relationship with water: in the process of identifying an emotional response, participants synthesize a tension between the service they think they are entitled to, and the service they could realistically have in a context of water scarcity and precarious infrastructure. At the same time, these perceptions are shaped by their </w:t>
+      </w:r>
+      <w:r>
+        <w:rPr>
+          <w:rFonts w:eastAsia="Times New Roman"/>
+          <w:color w:val="000000"/>
+        </w:rPr>
+        <w:lastRenderedPageBreak/>
+        <w:t xml:space="preserve">knowledge of others with worse or better water access, their and their family’s histories with water access, and what they expect for the future in the midst of </w:t>
+      </w:r>
+      <w:r>
+        <w:rPr>
+          <w:rFonts w:eastAsia="Times New Roman"/>
+          <w:color w:val="000000"/>
+          <w:shd w:val="clear" w:color="auto" w:fill="B7B7B7"/>
+        </w:rPr>
+        <w:t>catastrophic narratives of</w:t>
+      </w:r>
+      <w:r>
+        <w:rPr>
+          <w:rFonts w:eastAsia="Times New Roman"/>
+          <w:color w:val="000000"/>
+        </w:rPr>
+        <w:t xml:space="preserve"> inevitable water crisis. </w:t>
+      </w:r>
+    </w:p>
+    <w:p>
+      <w:pPr>
+        <w:rPr>
+          <w:rFonts w:ascii="Times New Roman" w:eastAsia="Times New Roman" w:hAnsi="Times New Roman" w:cs="Times New Roman"/>
+          <w:sz w:val="24"/>
+          <w:szCs w:val="24"/>
+        </w:rPr>
+      </w:pPr>
+    </w:p>
+    <w:p>
+      <w:pPr>
+        <w:rPr>
+          <w:rFonts w:ascii="Times New Roman" w:eastAsia="Times New Roman" w:hAnsi="Times New Roman" w:cs="Times New Roman"/>
+          <w:sz w:val="24"/>
+          <w:szCs w:val="24"/>
+        </w:rPr>
+      </w:pPr>
+    </w:p>
+    <w:p>
+      <w:pPr>
+        <w:spacing w:before="100" w:after="100"/>
+        <w:rPr>
+          <w:rFonts w:ascii="Times New Roman" w:eastAsia="Times New Roman" w:hAnsi="Times New Roman" w:cs="Times New Roman"/>
+          <w:sz w:val="24"/>
+          <w:szCs w:val="24"/>
+        </w:rPr>
+      </w:pPr>
+      <w:r>
+        <w:rPr>
+          <w:rFonts w:eastAsia="Times New Roman"/>
+          <w:color w:val="000000"/>
+        </w:rPr>
+        <w:t>the exceptionally negative evaluation of the system in Iztapalapa (XX). </w:t>
+      </w:r>
+    </w:p>
+    <w:p>
+      <w:pPr>
+        <w:spacing w:before="100" w:after="100"/>
+        <w:rPr>
+          <w:rFonts w:ascii="Times New Roman" w:eastAsia="Times New Roman" w:hAnsi="Times New Roman" w:cs="Times New Roman"/>
+          <w:sz w:val="24"/>
+          <w:szCs w:val="24"/>
+        </w:rPr>
+      </w:pPr>
+      <w:r>
+        <w:rPr>
+          <w:rFonts w:eastAsia="Times New Roman"/>
+          <w:color w:val="000000"/>
+        </w:rPr>
+        <w:t xml:space="preserve">Our results demonstrate that this </w:t>
+      </w:r>
+      <w:r>
+        <w:rPr>
+          <w:rFonts w:eastAsia="Times New Roman"/>
+          <w:color w:val="000000"/>
+          <w:shd w:val="clear" w:color="auto" w:fill="B7B7B7"/>
+        </w:rPr>
+        <w:t xml:space="preserve">sense of inequality may be an important variable when considering the potential emergence of social conflict, </w:t>
+      </w:r>
+      <w:r>
+        <w:rPr>
+          <w:rFonts w:eastAsia="Times New Roman"/>
+          <w:color w:val="000000"/>
+        </w:rPr>
+        <w:t>and the participatory nature that future interventions to alleviate water insecurity should have. This suggests that interventions addressing the perceived fairness of water distribution, not only aggregate supply, may be more effective at reducing water-related distress and more likely to generate community support.</w:t>
+      </w:r>
+    </w:p>
+    <w:p>
+      <w:pPr>
+        <w:rPr>
+          <w:rFonts w:ascii="Times New Roman" w:eastAsia="Times New Roman" w:hAnsi="Times New Roman" w:cs="Times New Roman"/>
+          <w:sz w:val="24"/>
+          <w:szCs w:val="24"/>
+        </w:rPr>
+      </w:pPr>
+    </w:p>
+    <w:p>
+      <w:pPr>
+        <w:rPr>
+          <w:rFonts w:ascii="Times New Roman" w:eastAsia="Times New Roman" w:hAnsi="Times New Roman" w:cs="Times New Roman"/>
+          <w:sz w:val="24"/>
+          <w:szCs w:val="24"/>
+        </w:rPr>
+      </w:pPr>
+    </w:p>
+    <w:p>
+      <w:pPr>
+        <w:spacing w:before="100" w:after="100"/>
+        <w:rPr>
+          <w:rFonts w:ascii="Times New Roman" w:eastAsia="Times New Roman" w:hAnsi="Times New Roman" w:cs="Times New Roman"/>
+          <w:sz w:val="24"/>
+          <w:szCs w:val="24"/>
+        </w:rPr>
+      </w:pPr>
+      <w:r>
+        <w:rPr>
+          <w:rFonts w:eastAsia="Times New Roman"/>
+          <w:b/>
+          <w:bCs/>
+          <w:color w:val="000000"/>
+        </w:rPr>
+        <w:t>Notes, may include, or may not:</w:t>
+      </w:r>
+    </w:p>
+    <w:p>
+      <w:pPr>
+        <w:spacing w:before="100" w:after="100"/>
+        <w:rPr>
+          <w:rFonts w:ascii="Times New Roman" w:eastAsia="Times New Roman" w:hAnsi="Times New Roman" w:cs="Times New Roman"/>
+          <w:sz w:val="24"/>
+          <w:szCs w:val="24"/>
+        </w:rPr>
+      </w:pPr>
+      <w:r>
+        <w:rPr>
+          <w:rFonts w:eastAsia="Times New Roman"/>
+          <w:color w:val="000000"/>
+        </w:rPr>
+        <w:t xml:space="preserve">For </w:t>
+      </w:r>
+      <w:r>
+        <w:rPr>
+          <w:rFonts w:eastAsia="Times New Roman"/>
+          <w:b/>
+          <w:bCs/>
+          <w:color w:val="000000"/>
+        </w:rPr>
+        <w:t>intervention</w:t>
+      </w:r>
+      <w:r>
+        <w:rPr>
+          <w:rFonts w:eastAsia="Times New Roman"/>
+          <w:color w:val="000000"/>
+        </w:rPr>
+        <w:t>: the strongest predictors of water-related emotional distress — supply intermittency, time burden, and perceived distributional unfairness — suggest that the predictability and perceived equity of water distribution may be as important as total volume supplied. Infrastructure improvements that reduce intermittency and increase supply consistency, and community communication strategies that address perceptions of unequal distribution, may yield emotional and psychological benefits even where total supply volumes cannot be quickly increased. Future longitudinal work is needed to establish whether the associations identified here reflect causal pathways, to track whether stress accumulates over seasons at the individual level, and to connect the psychosocial burden documented in this study to biological markers of chronic stress, including epigenetic signatures of allostatic load.</w:t>
+      </w:r>
+    </w:p>
+    <w:p>
+      <w:pPr>
+        <w:spacing w:after="240"/>
+        <w:rPr>
+          <w:rFonts w:ascii="Times New Roman" w:eastAsia="Times New Roman" w:hAnsi="Times New Roman" w:cs="Times New Roman"/>
+          <w:sz w:val="24"/>
+          <w:szCs w:val="24"/>
+        </w:rPr>
+      </w:pPr>
+      <w:r>
+        <w:rPr>
+          <w:rFonts w:ascii="Times New Roman" w:eastAsia="Times New Roman" w:hAnsi="Times New Roman" w:cs="Times New Roman"/>
+          <w:sz w:val="24"/>
+          <w:szCs w:val="24"/>
+        </w:rPr>
+        <w:br/>
+      </w:r>
+      <w:r>
+        <w:rPr>
+          <w:rFonts w:ascii="Times New Roman" w:eastAsia="Times New Roman" w:hAnsi="Times New Roman" w:cs="Times New Roman"/>
+          <w:sz w:val="24"/>
+          <w:szCs w:val="24"/>
+        </w:rPr>
+        <w:br/>
+      </w:r>
+    </w:p>
+    <w:p>
+      <w:pPr>
+        <w:spacing w:before="100" w:after="100"/>
+        <w:rPr>
+          <w:rFonts w:ascii="Times New Roman" w:eastAsia="Times New Roman" w:hAnsi="Times New Roman" w:cs="Times New Roman"/>
+          <w:sz w:val="24"/>
+          <w:szCs w:val="24"/>
+        </w:rPr>
+      </w:pPr>
+      <w:r>
+        <w:rPr>
+          <w:rFonts w:eastAsia="Times New Roman"/>
+          <w:b/>
+          <w:bCs/>
+          <w:color w:val="000000"/>
+        </w:rPr>
+        <w:t>One thing missing from the discussion overall</w:t>
+      </w:r>
+      <w:r>
+        <w:rPr>
+          <w:rFonts w:eastAsia="Times New Roman"/>
+          <w:color w:val="000000"/>
+        </w:rPr>
+        <w:t xml:space="preserve"> — the item-level pattern for PSS is in your results but never interpreted in the discussion: that PSS is driven specifically by affective and hygiene-related HWISE items (worry, anger, inability to bathe, going to sleep thirsty) rather than severe access failures (no water at all, can't wash hands). This connects directly to the dignity and daily routine disruption argument and is worth one sentence somewhere, perhaps in paragraph 2 or 4.</w:t>
+      </w:r>
+    </w:p>
+    <w:p>
+      <w:pPr>
+        <w:rPr>
+          <w:rFonts w:ascii="Times New Roman" w:eastAsia="Times New Roman" w:hAnsi="Times New Roman" w:cs="Times New Roman"/>
+          <w:sz w:val="24"/>
+          <w:szCs w:val="24"/>
+        </w:rPr>
+      </w:pPr>
+      <w:r>
+        <w:rPr>
+          <w:rFonts w:ascii="Times New Roman" w:eastAsia="Times New Roman" w:hAnsi="Times New Roman" w:cs="Times New Roman"/>
+          <w:sz w:val="24"/>
+          <w:szCs w:val="24"/>
+        </w:rPr>
+        <w:br/>
+      </w:r>
+    </w:p>
+    <w:p>
+      <w:pPr>
+        <w:numPr>
+          <w:ilvl w:val="0"/>
+          <w:numId w:val="4"/>
+        </w:numPr>
+        <w:spacing w:before="240"/>
+        <w:textAlignment w:val="baseline"/>
+        <w:rPr>
+          <w:rFonts w:eastAsia="Times New Roman"/>
+          <w:color w:val="000000"/>
+        </w:rPr>
+      </w:pPr>
+      <w:r>
+        <w:rPr>
+          <w:rFonts w:eastAsia="Times New Roman"/>
+          <w:color w:val="000000"/>
+        </w:rPr>
+        <w:t>Compare values to those reported for other countries, and for Mexico in other studies</w:t>
+      </w:r>
+    </w:p>
+    <w:p>
+      <w:pPr>
+        <w:numPr>
+          <w:ilvl w:val="0"/>
+          <w:numId w:val="4"/>
+        </w:numPr>
+        <w:textAlignment w:val="baseline"/>
+        <w:rPr>
+          <w:rFonts w:eastAsia="Times New Roman"/>
+          <w:color w:val="000000"/>
+        </w:rPr>
+      </w:pPr>
+      <w:r>
+        <w:rPr>
+          <w:rFonts w:eastAsia="Times New Roman"/>
+          <w:color w:val="000000"/>
+        </w:rPr>
+        <w:t>This population has a lot more water insecure households than the average in the country</w:t>
+      </w:r>
+    </w:p>
+    <w:p>
+      <w:pPr>
+        <w:numPr>
+          <w:ilvl w:val="0"/>
+          <w:numId w:val="5"/>
+        </w:numPr>
+        <w:spacing w:after="240"/>
+        <w:textAlignment w:val="baseline"/>
+        <w:rPr>
+          <w:rFonts w:eastAsia="Times New Roman"/>
+          <w:color w:val="000000"/>
+        </w:rPr>
+      </w:pPr>
+      <w:r>
+        <w:rPr>
+          <w:rFonts w:eastAsia="Times New Roman"/>
+          <w:color w:val="000000"/>
+        </w:rPr>
+        <w:t>More rich information on water-coping behaviors that cause stress: drinking water perceived to be unsafe, spending more on water treatment, borrowing water from others, subsequently feeling indebted to them, or withdrawing from social engagements, said in Thomson 2024, citing (23) Wenkataramanan et al. 2020. “Coping strategies for individual and household-level water insecurity: a systematic review. . </w:t>
+      </w:r>
+    </w:p>
+    <w:p>
+      <w:pPr>
+        <w:spacing w:before="100" w:after="100"/>
+        <w:rPr>
+          <w:rFonts w:ascii="Times New Roman" w:eastAsia="Times New Roman" w:hAnsi="Times New Roman" w:cs="Times New Roman"/>
+          <w:sz w:val="24"/>
+          <w:szCs w:val="24"/>
+        </w:rPr>
+      </w:pPr>
+      <w:r>
+        <w:rPr>
+          <w:rFonts w:eastAsia="Times New Roman"/>
+          <w:color w:val="000000"/>
+        </w:rPr>
+        <w:lastRenderedPageBreak/>
+        <w:t>The incorporation of the HWISE into Mexico’s national health survey (ENSANUT) since 2021 has extended this evidence base, confirming the scale’s reliability and validity across urban and rural Mexican populations (Shamah-Levy et al., 2022). Nevertheless, nationally aggregated data cannot capture the local dynamics of water insecurity in communities with particular infrastructural histories, neighborhood-level inequalities, and culturally embedded expectations about water access — the kind of granular, context-specific understanding needed to design effective local interventions.</w:t>
+      </w:r>
+    </w:p>
+    <w:p>
+      <w:pPr>
+        <w:spacing w:before="60" w:after="60"/>
+        <w:rPr>
+          <w:rFonts w:ascii="Times New Roman" w:eastAsia="Times New Roman" w:hAnsi="Times New Roman" w:cs="Times New Roman"/>
+          <w:sz w:val="24"/>
+          <w:szCs w:val="24"/>
+        </w:rPr>
+      </w:pPr>
+      <w:r>
+        <w:rPr>
+          <w:rFonts w:eastAsia="Times New Roman"/>
+          <w:color w:val="000000"/>
+        </w:rPr>
+        <w:t>•</w:t>
+      </w:r>
+      <w:r>
+        <w:rPr>
+          <w:rFonts w:ascii="Times New Roman" w:eastAsia="Times New Roman" w:hAnsi="Times New Roman" w:cs="Times New Roman"/>
+          <w:color w:val="000000"/>
+          <w:sz w:val="14"/>
+          <w:szCs w:val="14"/>
+        </w:rPr>
+        <w:t xml:space="preserve">   </w:t>
+      </w:r>
+      <w:r>
+        <w:rPr>
+          <w:rFonts w:ascii="Times New Roman" w:eastAsia="Times New Roman" w:hAnsi="Times New Roman" w:cs="Times New Roman"/>
+          <w:color w:val="000000"/>
+          <w:sz w:val="14"/>
+          <w:szCs w:val="14"/>
+        </w:rPr>
+        <w:tab/>
+      </w:r>
+      <w:r>
+        <w:rPr>
+          <w:rFonts w:eastAsia="Times New Roman"/>
+          <w:color w:val="000000"/>
+        </w:rPr>
+        <w:t>Tells us that perception is important, but also, how trustworthy can be government classifications/priorization of their programs to relieve water insecurity?</w:t>
+      </w:r>
+    </w:p>
+    <w:p>
+      <w:pPr>
+        <w:spacing w:before="60" w:after="60"/>
+        <w:rPr>
+          <w:rFonts w:ascii="Times New Roman" w:eastAsia="Times New Roman" w:hAnsi="Times New Roman" w:cs="Times New Roman"/>
+          <w:sz w:val="24"/>
+          <w:szCs w:val="24"/>
+        </w:rPr>
+      </w:pPr>
+      <w:r>
+        <w:rPr>
+          <w:rFonts w:eastAsia="Times New Roman"/>
+          <w:color w:val="000000"/>
+        </w:rPr>
+        <w:t>•</w:t>
+      </w:r>
+      <w:r>
+        <w:rPr>
+          <w:rFonts w:ascii="Times New Roman" w:eastAsia="Times New Roman" w:hAnsi="Times New Roman" w:cs="Times New Roman"/>
+          <w:color w:val="000000"/>
+          <w:sz w:val="14"/>
+          <w:szCs w:val="14"/>
+        </w:rPr>
+        <w:t xml:space="preserve">   </w:t>
+      </w:r>
+      <w:r>
+        <w:rPr>
+          <w:rFonts w:ascii="Times New Roman" w:eastAsia="Times New Roman" w:hAnsi="Times New Roman" w:cs="Times New Roman"/>
+          <w:color w:val="000000"/>
+          <w:sz w:val="14"/>
+          <w:szCs w:val="14"/>
+        </w:rPr>
+        <w:tab/>
+      </w:r>
+      <w:r>
+        <w:rPr>
+          <w:rFonts w:eastAsia="Times New Roman"/>
+          <w:color w:val="000000"/>
+        </w:rPr>
+        <w:t>Thomson 2024: supply interruptions increase distress and maladaptive coping; predictability mitigates effects 25–50%. Maybe intermittency cannot be fixed in the short term, but can ensure predictability, felt control matters as much as frequency of interruption</w:t>
+      </w:r>
+    </w:p>
+    <w:p>
+      <w:pPr>
+        <w:spacing w:before="60" w:after="60"/>
+        <w:rPr>
+          <w:rFonts w:ascii="Times New Roman" w:eastAsia="Times New Roman" w:hAnsi="Times New Roman" w:cs="Times New Roman"/>
+          <w:sz w:val="24"/>
+          <w:szCs w:val="24"/>
+        </w:rPr>
+      </w:pPr>
+      <w:r>
+        <w:rPr>
+          <w:rFonts w:eastAsia="Times New Roman"/>
+          <w:color w:val="000000"/>
+        </w:rPr>
+        <w:t>•</w:t>
+      </w:r>
+      <w:r>
+        <w:rPr>
+          <w:rFonts w:ascii="Times New Roman" w:eastAsia="Times New Roman" w:hAnsi="Times New Roman" w:cs="Times New Roman"/>
+          <w:color w:val="000000"/>
+          <w:sz w:val="14"/>
+          <w:szCs w:val="14"/>
+        </w:rPr>
+        <w:t xml:space="preserve">   </w:t>
+      </w:r>
+      <w:r>
+        <w:rPr>
+          <w:rFonts w:ascii="Times New Roman" w:eastAsia="Times New Roman" w:hAnsi="Times New Roman" w:cs="Times New Roman"/>
+          <w:color w:val="000000"/>
+          <w:sz w:val="14"/>
+          <w:szCs w:val="14"/>
+        </w:rPr>
+        <w:tab/>
+      </w:r>
+      <w:r>
+        <w:rPr>
+          <w:rFonts w:eastAsia="Times New Roman"/>
+          <w:color w:val="000000"/>
+        </w:rPr>
+        <w:t>PSS (general stress) predicted by affective/functional HWISE items: worry, anger, can’t bathe, sleep disrupted — items touching dignity and daily routine</w:t>
+      </w:r>
+    </w:p>
+    <w:p>
+      <w:pPr>
+        <w:spacing w:before="60" w:after="60"/>
+        <w:rPr>
+          <w:rFonts w:ascii="Times New Roman" w:eastAsia="Times New Roman" w:hAnsi="Times New Roman" w:cs="Times New Roman"/>
+          <w:sz w:val="24"/>
+          <w:szCs w:val="24"/>
+        </w:rPr>
+      </w:pPr>
+      <w:r>
+        <w:rPr>
+          <w:rFonts w:eastAsia="Times New Roman"/>
+          <w:color w:val="000000"/>
+        </w:rPr>
+        <w:t>•</w:t>
+      </w:r>
+      <w:r>
+        <w:rPr>
+          <w:rFonts w:ascii="Times New Roman" w:eastAsia="Times New Roman" w:hAnsi="Times New Roman" w:cs="Times New Roman"/>
+          <w:color w:val="000000"/>
+          <w:sz w:val="14"/>
+          <w:szCs w:val="14"/>
+        </w:rPr>
+        <w:t xml:space="preserve">   </w:t>
+      </w:r>
+      <w:r>
+        <w:rPr>
+          <w:rFonts w:ascii="Times New Roman" w:eastAsia="Times New Roman" w:hAnsi="Times New Roman" w:cs="Times New Roman"/>
+          <w:color w:val="000000"/>
+          <w:sz w:val="14"/>
+          <w:szCs w:val="14"/>
+        </w:rPr>
+        <w:tab/>
+      </w:r>
+      <w:r>
+        <w:rPr>
+          <w:rFonts w:eastAsia="Times New Roman"/>
+          <w:color w:val="000000"/>
+        </w:rPr>
+        <w:t>Negative water emotion predicted by structural/material variables too: intermittency, supply frequency, hours, time burden, neighborhood comparison</w:t>
+      </w:r>
+    </w:p>
+    <w:p>
+      <w:pPr>
+        <w:spacing w:before="60" w:after="60"/>
+        <w:rPr>
+          <w:rFonts w:ascii="Times New Roman" w:eastAsia="Times New Roman" w:hAnsi="Times New Roman" w:cs="Times New Roman"/>
+          <w:sz w:val="24"/>
+          <w:szCs w:val="24"/>
+        </w:rPr>
+      </w:pPr>
+      <w:r>
+        <w:rPr>
+          <w:rFonts w:eastAsia="Times New Roman"/>
+          <w:color w:val="000000"/>
+        </w:rPr>
+        <w:t>•</w:t>
+      </w:r>
+      <w:r>
+        <w:rPr>
+          <w:rFonts w:ascii="Times New Roman" w:eastAsia="Times New Roman" w:hAnsi="Times New Roman" w:cs="Times New Roman"/>
+          <w:color w:val="000000"/>
+          <w:sz w:val="14"/>
+          <w:szCs w:val="14"/>
+        </w:rPr>
+        <w:t xml:space="preserve">   </w:t>
+      </w:r>
+      <w:r>
+        <w:rPr>
+          <w:rFonts w:ascii="Times New Roman" w:eastAsia="Times New Roman" w:hAnsi="Times New Roman" w:cs="Times New Roman"/>
+          <w:color w:val="000000"/>
+          <w:sz w:val="14"/>
+          <w:szCs w:val="14"/>
+        </w:rPr>
+        <w:tab/>
+      </w:r>
+      <w:r>
+        <w:rPr>
+          <w:rFonts w:eastAsia="Times New Roman"/>
+          <w:color w:val="000000"/>
+        </w:rPr>
+        <w:t>Time handling water (OR=5.95) and intermittency (OR=2.97) predict negative emotion and stay significant alongside HWISE — additive, not redundant</w:t>
+      </w:r>
+    </w:p>
+    <w:p>
+      <w:pPr>
+        <w:spacing w:before="60" w:after="60"/>
+        <w:rPr>
+          <w:rFonts w:ascii="Times New Roman" w:eastAsia="Times New Roman" w:hAnsi="Times New Roman" w:cs="Times New Roman"/>
+          <w:sz w:val="24"/>
+          <w:szCs w:val="24"/>
+        </w:rPr>
+      </w:pPr>
+      <w:r>
+        <w:rPr>
+          <w:rFonts w:eastAsia="Times New Roman"/>
+          <w:color w:val="000000"/>
+        </w:rPr>
+        <w:t>•</w:t>
+      </w:r>
+      <w:r>
+        <w:rPr>
+          <w:rFonts w:ascii="Times New Roman" w:eastAsia="Times New Roman" w:hAnsi="Times New Roman" w:cs="Times New Roman"/>
+          <w:color w:val="000000"/>
+          <w:sz w:val="14"/>
+          <w:szCs w:val="14"/>
+        </w:rPr>
+        <w:t xml:space="preserve">   </w:t>
+      </w:r>
+      <w:r>
+        <w:rPr>
+          <w:rFonts w:ascii="Times New Roman" w:eastAsia="Times New Roman" w:hAnsi="Times New Roman" w:cs="Times New Roman"/>
+          <w:color w:val="000000"/>
+          <w:sz w:val="14"/>
+          <w:szCs w:val="14"/>
+        </w:rPr>
+        <w:tab/>
+      </w:r>
+      <w:r>
+        <w:rPr>
+          <w:rFonts w:eastAsia="Times New Roman"/>
+          <w:color w:val="000000"/>
+        </w:rPr>
+        <w:t>HWISE × neighborhood comparison interaction: perceiving your neighborhood’s water as worse amplifies the HWISE-emotion association — relative deprivation dynamic</w:t>
+      </w:r>
+    </w:p>
+    <w:p>
+      <w:pPr>
+        <w:spacing w:before="80" w:after="80" w:line="276" w:lineRule="auto"/>
+      </w:pPr>
+      <w:r>
+        <w:rPr>
+          <w:rFonts w:eastAsia="Times New Roman"/>
+          <w:color w:val="000000"/>
+        </w:rPr>
+        <w:t>•</w:t>
+      </w:r>
+      <w:r>
+        <w:rPr>
+          <w:rFonts w:ascii="Times New Roman" w:eastAsia="Times New Roman" w:hAnsi="Times New Roman" w:cs="Times New Roman"/>
+          <w:color w:val="000000"/>
+          <w:sz w:val="14"/>
+          <w:szCs w:val="14"/>
+        </w:rPr>
+        <w:t xml:space="preserve">   </w:t>
+      </w:r>
+      <w:r>
+        <w:rPr>
+          <w:rFonts w:ascii="Times New Roman" w:eastAsia="Times New Roman" w:hAnsi="Times New Roman" w:cs="Times New Roman"/>
+          <w:color w:val="000000"/>
+          <w:sz w:val="14"/>
+          <w:szCs w:val="14"/>
+        </w:rPr>
+        <w:tab/>
+      </w:r>
+      <w:r>
+        <w:rPr>
+          <w:rFonts w:eastAsia="Times New Roman"/>
+          <w:color w:val="000000"/>
+        </w:rPr>
+        <w:t>PSS co-varies with clinical mental health outcomes (depression); water emotion reflects appraisal of service quality rather than coping self-efficacy</w:t>
       </w:r>
     </w:p>
     <w:sectPr>
@@ -3098,6 +2498,25 @@
     </w:sectPr>
   </w:body>
 </w:document>
+</file>
+
+<file path=word/endnotes.xml><?xml version="1.0" encoding="utf-8"?>
+<w:endnotes xmlns:wpc="http://schemas.microsoft.com/office/word/2010/wordprocessingCanvas" xmlns:cx="http://schemas.microsoft.com/office/drawing/2014/chartex" xmlns:cx1="http://schemas.microsoft.com/office/drawing/2015/9/8/chartex" xmlns:cx2="http://schemas.microsoft.com/office/drawing/2015/10/21/chartex" xmlns:cx3="http://schemas.microsoft.com/office/drawing/2016/5/9/chartex" xmlns:cx4="http://schemas.microsoft.com/office/drawing/2016/5/10/chartex" xmlns:cx5="http://schemas.microsoft.com/office/drawing/2016/5/11/chartex" xmlns:cx6="http://schemas.microsoft.com/office/drawing/2016/5/12/chartex" xmlns:cx7="http://schemas.microsoft.com/office/drawing/2016/5/13/chartex" xmlns:cx8="http://schemas.microsoft.com/office/drawing/2016/5/14/chartex" xmlns:mc="http://schemas.openxmlformats.org/markup-compatibility/2006" xmlns:aink="http://schemas.microsoft.com/office/drawing/2016/ink" xmlns:am3d="http://schemas.microsoft.com/office/drawing/2017/model3d" xmlns:o="urn:schemas-microsoft-com:office:office" xmlns:oel="http://schemas.microsoft.com/office/2019/extlst" xmlns:r="http://schemas.openxmlformats.org/officeDocument/2006/relationships" xmlns:m="http://schemas.openxmlformats.org/officeDocument/2006/math" xmlns:v="urn:schemas-microsoft-com:vml" xmlns:wp14="http://schemas.microsoft.com/office/word/2010/wordprocessingDrawing" xmlns:wp="http://schemas.openxmlformats.org/drawingml/2006/wordprocessingDrawing" xmlns:w10="urn:schemas-microsoft-com:office:word" xmlns:w="http://schemas.openxmlformats.org/wordprocessingml/2006/main" xmlns:w14="http://schemas.microsoft.com/office/word/2010/wordml" xmlns:w15="http://schemas.microsoft.com/office/word/2012/wordml" xmlns:w16cex="http://schemas.microsoft.com/office/word/2018/wordml/cex" xmlns:w16cid="http://schemas.microsoft.com/office/word/2016/wordml/cid" xmlns:w16="http://schemas.microsoft.com/office/word/2018/wordml" xmlns:w16du="http://schemas.microsoft.com/office/word/2023/wordml/word16du" xmlns:w16sdtdh="http://schemas.microsoft.com/office/word/2020/wordml/sdtdatahash" xmlns:w16sdtfl="http://schemas.microsoft.com/office/word/2024/wordml/sdtformatlock" xmlns:w16se="http://schemas.microsoft.com/office/word/2015/wordml/symex" xmlns:wpg="http://schemas.microsoft.com/office/word/2010/wordprocessingGroup" xmlns:wpi="http://schemas.microsoft.com/office/word/2010/wordprocessingInk" xmlns:wne="http://schemas.microsoft.com/office/word/2006/wordml" xmlns:wps="http://schemas.microsoft.com/office/word/2010/wordprocessingShape" mc:Ignorable="w14 w15 w16se w16cid w16 w16cex w16sdtdh w16sdtfl w16du wp14">
+  <w:endnote w:type="separator" w:id="-1">
+    <w:p>
+      <w:r>
+        <w:separator/>
+      </w:r>
+    </w:p>
+  </w:endnote>
+  <w:endnote w:type="continuationSeparator" w:id="0">
+    <w:p>
+      <w:r>
+        <w:continuationSeparator/>
+      </w:r>
+    </w:p>
+  </w:endnote>
+</w:endnotes>
 </file>
 
 <file path=word/footer1.xml><?xml version="1.0" encoding="utf-8"?>
@@ -3128,6 +2547,25 @@
 </w:ftr>
 </file>
 
+<file path=word/footnotes.xml><?xml version="1.0" encoding="utf-8"?>
+<w:footnotes xmlns:wpc="http://schemas.microsoft.com/office/word/2010/wordprocessingCanvas" xmlns:cx="http://schemas.microsoft.com/office/drawing/2014/chartex" xmlns:cx1="http://schemas.microsoft.com/office/drawing/2015/9/8/chartex" xmlns:cx2="http://schemas.microsoft.com/office/drawing/2015/10/21/chartex" xmlns:cx3="http://schemas.microsoft.com/office/drawing/2016/5/9/chartex" xmlns:cx4="http://schemas.microsoft.com/office/drawing/2016/5/10/chartex" xmlns:cx5="http://schemas.microsoft.com/office/drawing/2016/5/11/chartex" xmlns:cx6="http://schemas.microsoft.com/office/drawing/2016/5/12/chartex" xmlns:cx7="http://schemas.microsoft.com/office/drawing/2016/5/13/chartex" xmlns:cx8="http://schemas.microsoft.com/office/drawing/2016/5/14/chartex" xmlns:mc="http://schemas.openxmlformats.org/markup-compatibility/2006" xmlns:aink="http://schemas.microsoft.com/office/drawing/2016/ink" xmlns:am3d="http://schemas.microsoft.com/office/drawing/2017/model3d" xmlns:o="urn:schemas-microsoft-com:office:office" xmlns:oel="http://schemas.microsoft.com/office/2019/extlst" xmlns:r="http://schemas.openxmlformats.org/officeDocument/2006/relationships" xmlns:m="http://schemas.openxmlformats.org/officeDocument/2006/math" xmlns:v="urn:schemas-microsoft-com:vml" xmlns:wp14="http://schemas.microsoft.com/office/word/2010/wordprocessingDrawing" xmlns:wp="http://schemas.openxmlformats.org/drawingml/2006/wordprocessingDrawing" xmlns:w10="urn:schemas-microsoft-com:office:word" xmlns:w="http://schemas.openxmlformats.org/wordprocessingml/2006/main" xmlns:w14="http://schemas.microsoft.com/office/word/2010/wordml" xmlns:w15="http://schemas.microsoft.com/office/word/2012/wordml" xmlns:w16cex="http://schemas.microsoft.com/office/word/2018/wordml/cex" xmlns:w16cid="http://schemas.microsoft.com/office/word/2016/wordml/cid" xmlns:w16="http://schemas.microsoft.com/office/word/2018/wordml" xmlns:w16du="http://schemas.microsoft.com/office/word/2023/wordml/word16du" xmlns:w16sdtdh="http://schemas.microsoft.com/office/word/2020/wordml/sdtdatahash" xmlns:w16sdtfl="http://schemas.microsoft.com/office/word/2024/wordml/sdtformatlock" xmlns:w16se="http://schemas.microsoft.com/office/word/2015/wordml/symex" xmlns:wpg="http://schemas.microsoft.com/office/word/2010/wordprocessingGroup" xmlns:wpi="http://schemas.microsoft.com/office/word/2010/wordprocessingInk" xmlns:wne="http://schemas.microsoft.com/office/word/2006/wordml" xmlns:wps="http://schemas.microsoft.com/office/word/2010/wordprocessingShape" mc:Ignorable="w14 w15 w16se w16cid w16 w16cex w16sdtdh w16sdtfl w16du wp14">
+  <w:footnote w:type="separator" w:id="-1">
+    <w:p>
+      <w:r>
+        <w:separator/>
+      </w:r>
+    </w:p>
+  </w:footnote>
+  <w:footnote w:type="continuationSeparator" w:id="0">
+    <w:p>
+      <w:r>
+        <w:continuationSeparator/>
+      </w:r>
+    </w:p>
+  </w:footnote>
+</w:footnotes>
+</file>
+
 <file path=word/numbering.xml><?xml version="1.0" encoding="utf-8"?>
 <w:numbering xmlns:wpc="http://schemas.microsoft.com/office/word/2010/wordprocessingCanvas" xmlns:cx="http://schemas.microsoft.com/office/drawing/2014/chartex" xmlns:cx1="http://schemas.microsoft.com/office/drawing/2015/9/8/chartex" xmlns:cx2="http://schemas.microsoft.com/office/drawing/2015/10/21/chartex" xmlns:cx3="http://schemas.microsoft.com/office/drawing/2016/5/9/chartex" xmlns:cx4="http://schemas.microsoft.com/office/drawing/2016/5/10/chartex" xmlns:cx5="http://schemas.microsoft.com/office/drawing/2016/5/11/chartex" xmlns:cx6="http://schemas.microsoft.com/office/drawing/2016/5/12/chartex" xmlns:cx7="http://schemas.microsoft.com/office/drawing/2016/5/13/chartex" xmlns:cx8="http://schemas.microsoft.com/office/drawing/2016/5/14/chartex" xmlns:mc="http://schemas.openxmlformats.org/markup-compatibility/2006" xmlns:aink="http://schemas.microsoft.com/office/drawing/2016/ink" xmlns:am3d="http://schemas.microsoft.com/office/drawing/2017/model3d" xmlns:o="urn:schemas-microsoft-com:office:office" xmlns:oel="http://schemas.microsoft.com/office/2019/extlst" xmlns:r="http://schemas.openxmlformats.org/officeDocument/2006/relationships" xmlns:m="http://schemas.openxmlformats.org/officeDocument/2006/math" xmlns:v="urn:schemas-microsoft-com:vml" xmlns:wp14="http://schemas.microsoft.com/office/word/2010/wordprocessingDrawing" xmlns:wp="http://schemas.openxmlformats.org/drawingml/2006/wordprocessingDrawing" xmlns:w10="urn:schemas-microsoft-com:office:word" xmlns:w="http://schemas.openxmlformats.org/wordprocessingml/2006/main" xmlns:w14="http://schemas.microsoft.com/office/word/2010/wordml" xmlns:w15="http://schemas.microsoft.com/office/word/2012/wordml" xmlns:w16cex="http://schemas.microsoft.com/office/word/2018/wordml/cex" xmlns:w16cid="http://schemas.microsoft.com/office/word/2016/wordml/cid" xmlns:w16="http://schemas.microsoft.com/office/word/2018/wordml" xmlns:w16du="http://schemas.microsoft.com/office/word/2023/wordml/word16du" xmlns:w16sdtdh="http://schemas.microsoft.com/office/word/2020/wordml/sdtdatahash" xmlns:w16sdtfl="http://schemas.microsoft.com/office/word/2024/wordml/sdtformatlock" xmlns:w16se="http://schemas.microsoft.com/office/word/2015/wordml/symex" xmlns:wpg="http://schemas.microsoft.com/office/word/2010/wordprocessingGroup" xmlns:wpi="http://schemas.microsoft.com/office/word/2010/wordprocessingInk" xmlns:wne="http://schemas.microsoft.com/office/word/2006/wordml" xmlns:wps="http://schemas.microsoft.com/office/word/2010/wordprocessingShape" mc:Ignorable="w14 w15 w16se w16cid w16 w16cex w16sdtdh w16sdtfl w16du wp14">
   <w:abstractNum w:abstractNumId="0" w15:restartNumberingAfterBreak="0">
@@ -3244,6 +2682,304 @@
     </w:lvl>
   </w:abstractNum>
   <w:abstractNum w:abstractNumId="1" w15:restartNumberingAfterBreak="0">
+    <w:nsid w:val="37C77F8F"/>
+    <w:multiLevelType w:val="multilevel"/>
+    <w:tmpl w:val="B3461814"/>
+    <w:lvl w:ilvl="0">
+      <w:start w:val="1"/>
+      <w:numFmt w:val="bullet"/>
+      <w:lvlText w:val=""/>
+      <w:lvlJc w:val="left"/>
+      <w:pPr>
+        <w:tabs>
+          <w:tab w:val="num" w:pos="720"/>
+        </w:tabs>
+        <w:ind w:left="720" w:hanging="360"/>
+      </w:pPr>
+      <w:rPr>
+        <w:rFonts w:ascii="Symbol" w:hAnsi="Symbol" w:hint="default"/>
+        <w:sz w:val="20"/>
+      </w:rPr>
+    </w:lvl>
+    <w:lvl w:ilvl="1" w:tentative="1">
+      <w:start w:val="1"/>
+      <w:numFmt w:val="bullet"/>
+      <w:lvlText w:val="o"/>
+      <w:lvlJc w:val="left"/>
+      <w:pPr>
+        <w:tabs>
+          <w:tab w:val="num" w:pos="1440"/>
+        </w:tabs>
+        <w:ind w:left="1440" w:hanging="360"/>
+      </w:pPr>
+      <w:rPr>
+        <w:rFonts w:ascii="Courier New" w:hAnsi="Courier New" w:hint="default"/>
+        <w:sz w:val="20"/>
+      </w:rPr>
+    </w:lvl>
+    <w:lvl w:ilvl="2" w:tentative="1">
+      <w:start w:val="1"/>
+      <w:numFmt w:val="bullet"/>
+      <w:lvlText w:val=""/>
+      <w:lvlJc w:val="left"/>
+      <w:pPr>
+        <w:tabs>
+          <w:tab w:val="num" w:pos="2160"/>
+        </w:tabs>
+        <w:ind w:left="2160" w:hanging="360"/>
+      </w:pPr>
+      <w:rPr>
+        <w:rFonts w:ascii="Wingdings" w:hAnsi="Wingdings" w:hint="default"/>
+        <w:sz w:val="20"/>
+      </w:rPr>
+    </w:lvl>
+    <w:lvl w:ilvl="3" w:tentative="1">
+      <w:start w:val="1"/>
+      <w:numFmt w:val="bullet"/>
+      <w:lvlText w:val=""/>
+      <w:lvlJc w:val="left"/>
+      <w:pPr>
+        <w:tabs>
+          <w:tab w:val="num" w:pos="2880"/>
+        </w:tabs>
+        <w:ind w:left="2880" w:hanging="360"/>
+      </w:pPr>
+      <w:rPr>
+        <w:rFonts w:ascii="Wingdings" w:hAnsi="Wingdings" w:hint="default"/>
+        <w:sz w:val="20"/>
+      </w:rPr>
+    </w:lvl>
+    <w:lvl w:ilvl="4" w:tentative="1">
+      <w:start w:val="1"/>
+      <w:numFmt w:val="bullet"/>
+      <w:lvlText w:val=""/>
+      <w:lvlJc w:val="left"/>
+      <w:pPr>
+        <w:tabs>
+          <w:tab w:val="num" w:pos="3600"/>
+        </w:tabs>
+        <w:ind w:left="3600" w:hanging="360"/>
+      </w:pPr>
+      <w:rPr>
+        <w:rFonts w:ascii="Wingdings" w:hAnsi="Wingdings" w:hint="default"/>
+        <w:sz w:val="20"/>
+      </w:rPr>
+    </w:lvl>
+    <w:lvl w:ilvl="5" w:tentative="1">
+      <w:start w:val="1"/>
+      <w:numFmt w:val="bullet"/>
+      <w:lvlText w:val=""/>
+      <w:lvlJc w:val="left"/>
+      <w:pPr>
+        <w:tabs>
+          <w:tab w:val="num" w:pos="4320"/>
+        </w:tabs>
+        <w:ind w:left="4320" w:hanging="360"/>
+      </w:pPr>
+      <w:rPr>
+        <w:rFonts w:ascii="Wingdings" w:hAnsi="Wingdings" w:hint="default"/>
+        <w:sz w:val="20"/>
+      </w:rPr>
+    </w:lvl>
+    <w:lvl w:ilvl="6" w:tentative="1">
+      <w:start w:val="1"/>
+      <w:numFmt w:val="bullet"/>
+      <w:lvlText w:val=""/>
+      <w:lvlJc w:val="left"/>
+      <w:pPr>
+        <w:tabs>
+          <w:tab w:val="num" w:pos="5040"/>
+        </w:tabs>
+        <w:ind w:left="5040" w:hanging="360"/>
+      </w:pPr>
+      <w:rPr>
+        <w:rFonts w:ascii="Wingdings" w:hAnsi="Wingdings" w:hint="default"/>
+        <w:sz w:val="20"/>
+      </w:rPr>
+    </w:lvl>
+    <w:lvl w:ilvl="7" w:tentative="1">
+      <w:start w:val="1"/>
+      <w:numFmt w:val="bullet"/>
+      <w:lvlText w:val=""/>
+      <w:lvlJc w:val="left"/>
+      <w:pPr>
+        <w:tabs>
+          <w:tab w:val="num" w:pos="5760"/>
+        </w:tabs>
+        <w:ind w:left="5760" w:hanging="360"/>
+      </w:pPr>
+      <w:rPr>
+        <w:rFonts w:ascii="Wingdings" w:hAnsi="Wingdings" w:hint="default"/>
+        <w:sz w:val="20"/>
+      </w:rPr>
+    </w:lvl>
+    <w:lvl w:ilvl="8" w:tentative="1">
+      <w:start w:val="1"/>
+      <w:numFmt w:val="bullet"/>
+      <w:lvlText w:val=""/>
+      <w:lvlJc w:val="left"/>
+      <w:pPr>
+        <w:tabs>
+          <w:tab w:val="num" w:pos="6480"/>
+        </w:tabs>
+        <w:ind w:left="6480" w:hanging="360"/>
+      </w:pPr>
+      <w:rPr>
+        <w:rFonts w:ascii="Wingdings" w:hAnsi="Wingdings" w:hint="default"/>
+        <w:sz w:val="20"/>
+      </w:rPr>
+    </w:lvl>
+  </w:abstractNum>
+  <w:abstractNum w:abstractNumId="2" w15:restartNumberingAfterBreak="0">
+    <w:nsid w:val="56703E76"/>
+    <w:multiLevelType w:val="multilevel"/>
+    <w:tmpl w:val="F7DE80D6"/>
+    <w:lvl w:ilvl="0">
+      <w:start w:val="1"/>
+      <w:numFmt w:val="bullet"/>
+      <w:lvlText w:val=""/>
+      <w:lvlJc w:val="left"/>
+      <w:pPr>
+        <w:tabs>
+          <w:tab w:val="num" w:pos="720"/>
+        </w:tabs>
+        <w:ind w:left="720" w:hanging="360"/>
+      </w:pPr>
+      <w:rPr>
+        <w:rFonts w:ascii="Symbol" w:hAnsi="Symbol" w:hint="default"/>
+        <w:sz w:val="20"/>
+      </w:rPr>
+    </w:lvl>
+    <w:lvl w:ilvl="1" w:tentative="1">
+      <w:start w:val="1"/>
+      <w:numFmt w:val="bullet"/>
+      <w:lvlText w:val="o"/>
+      <w:lvlJc w:val="left"/>
+      <w:pPr>
+        <w:tabs>
+          <w:tab w:val="num" w:pos="1440"/>
+        </w:tabs>
+        <w:ind w:left="1440" w:hanging="360"/>
+      </w:pPr>
+      <w:rPr>
+        <w:rFonts w:ascii="Courier New" w:hAnsi="Courier New" w:hint="default"/>
+        <w:sz w:val="20"/>
+      </w:rPr>
+    </w:lvl>
+    <w:lvl w:ilvl="2" w:tentative="1">
+      <w:start w:val="1"/>
+      <w:numFmt w:val="bullet"/>
+      <w:lvlText w:val=""/>
+      <w:lvlJc w:val="left"/>
+      <w:pPr>
+        <w:tabs>
+          <w:tab w:val="num" w:pos="2160"/>
+        </w:tabs>
+        <w:ind w:left="2160" w:hanging="360"/>
+      </w:pPr>
+      <w:rPr>
+        <w:rFonts w:ascii="Wingdings" w:hAnsi="Wingdings" w:hint="default"/>
+        <w:sz w:val="20"/>
+      </w:rPr>
+    </w:lvl>
+    <w:lvl w:ilvl="3" w:tentative="1">
+      <w:start w:val="1"/>
+      <w:numFmt w:val="bullet"/>
+      <w:lvlText w:val=""/>
+      <w:lvlJc w:val="left"/>
+      <w:pPr>
+        <w:tabs>
+          <w:tab w:val="num" w:pos="2880"/>
+        </w:tabs>
+        <w:ind w:left="2880" w:hanging="360"/>
+      </w:pPr>
+      <w:rPr>
+        <w:rFonts w:ascii="Wingdings" w:hAnsi="Wingdings" w:hint="default"/>
+        <w:sz w:val="20"/>
+      </w:rPr>
+    </w:lvl>
+    <w:lvl w:ilvl="4" w:tentative="1">
+      <w:start w:val="1"/>
+      <w:numFmt w:val="bullet"/>
+      <w:lvlText w:val=""/>
+      <w:lvlJc w:val="left"/>
+      <w:pPr>
+        <w:tabs>
+          <w:tab w:val="num" w:pos="3600"/>
+        </w:tabs>
+        <w:ind w:left="3600" w:hanging="360"/>
+      </w:pPr>
+      <w:rPr>
+        <w:rFonts w:ascii="Wingdings" w:hAnsi="Wingdings" w:hint="default"/>
+        <w:sz w:val="20"/>
+      </w:rPr>
+    </w:lvl>
+    <w:lvl w:ilvl="5" w:tentative="1">
+      <w:start w:val="1"/>
+      <w:numFmt w:val="bullet"/>
+      <w:lvlText w:val=""/>
+      <w:lvlJc w:val="left"/>
+      <w:pPr>
+        <w:tabs>
+          <w:tab w:val="num" w:pos="4320"/>
+        </w:tabs>
+        <w:ind w:left="4320" w:hanging="360"/>
+      </w:pPr>
+      <w:rPr>
+        <w:rFonts w:ascii="Wingdings" w:hAnsi="Wingdings" w:hint="default"/>
+        <w:sz w:val="20"/>
+      </w:rPr>
+    </w:lvl>
+    <w:lvl w:ilvl="6" w:tentative="1">
+      <w:start w:val="1"/>
+      <w:numFmt w:val="bullet"/>
+      <w:lvlText w:val=""/>
+      <w:lvlJc w:val="left"/>
+      <w:pPr>
+        <w:tabs>
+          <w:tab w:val="num" w:pos="5040"/>
+        </w:tabs>
+        <w:ind w:left="5040" w:hanging="360"/>
+      </w:pPr>
+      <w:rPr>
+        <w:rFonts w:ascii="Wingdings" w:hAnsi="Wingdings" w:hint="default"/>
+        <w:sz w:val="20"/>
+      </w:rPr>
+    </w:lvl>
+    <w:lvl w:ilvl="7" w:tentative="1">
+      <w:start w:val="1"/>
+      <w:numFmt w:val="bullet"/>
+      <w:lvlText w:val=""/>
+      <w:lvlJc w:val="left"/>
+      <w:pPr>
+        <w:tabs>
+          <w:tab w:val="num" w:pos="5760"/>
+        </w:tabs>
+        <w:ind w:left="5760" w:hanging="360"/>
+      </w:pPr>
+      <w:rPr>
+        <w:rFonts w:ascii="Wingdings" w:hAnsi="Wingdings" w:hint="default"/>
+        <w:sz w:val="20"/>
+      </w:rPr>
+    </w:lvl>
+    <w:lvl w:ilvl="8" w:tentative="1">
+      <w:start w:val="1"/>
+      <w:numFmt w:val="bullet"/>
+      <w:lvlText w:val=""/>
+      <w:lvlJc w:val="left"/>
+      <w:pPr>
+        <w:tabs>
+          <w:tab w:val="num" w:pos="6480"/>
+        </w:tabs>
+        <w:ind w:left="6480" w:hanging="360"/>
+      </w:pPr>
+      <w:rPr>
+        <w:rFonts w:ascii="Wingdings" w:hAnsi="Wingdings" w:hint="default"/>
+        <w:sz w:val="20"/>
+      </w:rPr>
+    </w:lvl>
+  </w:abstractNum>
+  <w:abstractNum w:abstractNumId="3" w15:restartNumberingAfterBreak="0">
     <w:nsid w:val="69CC7B5B"/>
     <w:multiLevelType w:val="multilevel"/>
     <w:tmpl w:val="2EA49BD6"/>
@@ -3356,7 +3092,7 @@
       </w:rPr>
     </w:lvl>
   </w:abstractNum>
-  <w:abstractNum w:abstractNumId="2" w15:restartNumberingAfterBreak="0">
+  <w:abstractNum w:abstractNumId="4" w15:restartNumberingAfterBreak="0">
     <w:nsid w:val="7D7658AD"/>
     <w:multiLevelType w:val="hybridMultilevel"/>
     <w:tmpl w:val="5D2860C4"/>
@@ -3443,7 +3179,7 @@
     </w:lvl>
   </w:abstractNum>
   <w:num w:numId="1" w16cid:durableId="2110931435">
-    <w:abstractNumId w:val="2"/>
+    <w:abstractNumId w:val="4"/>
     <w:lvlOverride w:ilvl="0">
       <w:startOverride w:val="1"/>
     </w:lvlOverride>
@@ -3452,7 +3188,13 @@
     <w:abstractNumId w:val="0"/>
   </w:num>
   <w:num w:numId="3" w16cid:durableId="480581324">
+    <w:abstractNumId w:val="3"/>
+  </w:num>
+  <w:num w:numId="4" w16cid:durableId="217056024">
     <w:abstractNumId w:val="1"/>
+  </w:num>
+  <w:num w:numId="5" w16cid:durableId="274482595">
+    <w:abstractNumId w:val="2"/>
   </w:num>
 </w:numbering>
 </file>
@@ -4064,6 +3806,27 @@
       <w:szCs w:val="20"/>
     </w:rPr>
   </w:style>
+  <w:style w:type="paragraph" w:styleId="NormalWeb">
+    <w:name w:val="Normal (Web)"/>
+    <w:basedOn w:val="Normal"/>
+    <w:uiPriority w:val="99"/>
+    <w:semiHidden/>
+    <w:unhideWhenUsed/>
+    <w:rsid w:val="001D4364"/>
+    <w:pPr>
+      <w:spacing w:before="100" w:beforeAutospacing="1" w:after="100" w:afterAutospacing="1"/>
+    </w:pPr>
+    <w:rPr>
+      <w:rFonts w:ascii="Times New Roman" w:eastAsia="Times New Roman" w:hAnsi="Times New Roman" w:cs="Times New Roman"/>
+      <w:sz w:val="24"/>
+      <w:szCs w:val="24"/>
+    </w:rPr>
+  </w:style>
+  <w:style w:type="character" w:customStyle="1" w:styleId="apple-tab-span">
+    <w:name w:val="apple-tab-span"/>
+    <w:basedOn w:val="DefaultParagraphFont"/>
+    <w:rsid w:val="005B290D"/>
+  </w:style>
 </w:styles>
 </file>
 

</xml_diff>